<commit_message>
feat: publish AZ-900 courseware v2
</commit_message>
<xml_diff>
--- a/courseware/LG-Microsoft Azure Fundamentals (AZ-900).docx
+++ b/courseware/LG-Microsoft Azure Fundamentals (AZ-900).docx
@@ -49,7 +49,7 @@
         <w:drawing>
           <wp:inline xmlns:a="http://schemas.openxmlformats.org/drawingml/2006/main" xmlns:pic="http://schemas.openxmlformats.org/drawingml/2006/picture">
             <wp:extent cx="658368" cy="658368"/>
-            <wp:docPr id="1" name="Picture 1"/>
+            <wp:docPr id="1" name="Picture 1" descr="Tertiary Infotech Academy logo" title="Tertiary Infotech Academy logo"/>
             <wp:cNvGraphicFramePr>
               <a:graphicFrameLocks noChangeAspect="1"/>
             </wp:cNvGraphicFramePr>
@@ -188,7 +188,12 @@
           <w:color w:val="4B5563"/>
           <w:sz w:val="20"/>
         </w:rPr>
-        <w:t>Version 1</w:t>
+      </w:r>
+      <w:r>
+        <w:rPr>
+          <w:b/>
+        </w:rPr>
+        <w:t>Version 2.0</w:t>
       </w:r>
     </w:p>
     <w:p>
@@ -220,6 +225,9 @@
         <w:gridCol w:w="2412"/>
       </w:tblGrid>
       <w:tr>
+        <w:trPr>
+          <w:tblHeader w:val="true"/>
+        </w:trPr>
         <w:tc>
           <w:tcPr>
             <w:tcW w:type="dxa" w:w="2412"/>
@@ -323,6 +331,48 @@
           </w:p>
         </w:tc>
       </w:tr>
+      <w:tr>
+        <w:tc>
+          <w:tcPr>
+            <w:tcW w:type="dxa" w:w="2412"/>
+          </w:tcPr>
+          <w:p>
+            <w:r>
+              <w:t>2.0</w:t>
+            </w:r>
+          </w:p>
+        </w:tc>
+        <w:tc>
+          <w:tcPr>
+            <w:tcW w:type="dxa" w:w="2412"/>
+          </w:tcPr>
+          <w:p>
+            <w:r>
+              <w:t>26 August 2026</w:t>
+            </w:r>
+          </w:p>
+        </w:tc>
+        <w:tc>
+          <w:tcPr>
+            <w:tcW w:type="dxa" w:w="2412"/>
+          </w:tcPr>
+          <w:p>
+            <w:r>
+              <w:t>Expanded conceptual reference to the July 2026 AZ-900 blueprint; retained and revalidated all 16 detailed lab procedures.</w:t>
+            </w:r>
+          </w:p>
+        </w:tc>
+        <w:tc>
+          <w:tcPr>
+            <w:tcW w:type="dxa" w:w="2412"/>
+          </w:tcPr>
+          <w:p>
+            <w:r>
+              <w:t>Tertiary Infotech Academy Pte Ltd</w:t>
+            </w:r>
+          </w:p>
+        </w:tc>
+      </w:tr>
     </w:tbl>
     <w:p/>
     <w:p>
@@ -651,7 +701,7 @@
         <w:drawing>
           <wp:inline xmlns:a="http://schemas.openxmlformats.org/drawingml/2006/main" xmlns:pic="http://schemas.openxmlformats.org/drawingml/2006/picture">
             <wp:extent cx="5852160" cy="3291840"/>
-            <wp:docPr id="2" name="Picture 2"/>
+            <wp:docPr id="2" name="Picture 2" descr="Two-day Azure lab flow from portal and Cloud Shell to services and governance" title="Two-day Azure lab flow from portal and Cloud Shell to services and governance"/>
             <wp:cNvGraphicFramePr>
               <a:graphicFrameLocks noChangeAspect="1"/>
             </wp:cNvGraphicFramePr>
@@ -711,7 +761,7 @@
         <w:drawing>
           <wp:inline xmlns:a="http://schemas.openxmlformats.org/drawingml/2006/main" xmlns:pic="http://schemas.openxmlformats.org/drawingml/2006/picture">
             <wp:extent cx="5852160" cy="3291840"/>
-            <wp:docPr id="3" name="Picture 3"/>
+            <wp:docPr id="3" name="Picture 3" descr="Azure services practised across compute, network, data and identity" title="Azure services practised across compute, network, data and identity"/>
             <wp:cNvGraphicFramePr>
               <a:graphicFrameLocks noChangeAspect="1"/>
             </wp:cNvGraphicFramePr>
@@ -771,7 +821,7 @@
         <w:drawing>
           <wp:inline xmlns:a="http://schemas.openxmlformats.org/drawingml/2006/main" xmlns:pic="http://schemas.openxmlformats.org/drawingml/2006/picture">
             <wp:extent cx="5852160" cy="3291840"/>
-            <wp:docPr id="4" name="Picture 4"/>
+            <wp:docPr id="4" name="Picture 4" descr="AZ-900 exam-domain weight and lab-priority matrix" title="AZ-900 exam-domain weight and lab-priority matrix"/>
             <wp:cNvGraphicFramePr>
               <a:graphicFrameLocks noChangeAspect="1"/>
             </wp:cNvGraphicFramePr>
@@ -831,7 +881,7 @@
         <w:drawing>
           <wp:inline xmlns:a="http://schemas.openxmlformats.org/drawingml/2006/main" xmlns:pic="http://schemas.openxmlformats.org/drawingml/2006/picture">
             <wp:extent cx="5852160" cy="3291840"/>
-            <wp:docPr id="5" name="Picture 5"/>
+            <wp:docPr id="5" name="Picture 5" descr="Azure shared-responsibility layers from physical datacentre to identity and data" title="Azure shared-responsibility layers from physical datacentre to identity and data"/>
             <wp:cNvGraphicFramePr>
               <a:graphicFrameLocks noChangeAspect="1"/>
             </wp:cNvGraphicFramePr>
@@ -978,7 +1028,7 @@
         <w:pStyle w:val="ListNumber"/>
       </w:pPr>
       <w:r>
-        <w:t>Open a browser and go to **https://portal.azure.com**.</w:t>
+        <w:t>Open a browser and go to https://portal.azure.com.</w:t>
       </w:r>
     </w:p>
     <w:p>
@@ -986,7 +1036,7 @@
         <w:pStyle w:val="ListNumber"/>
       </w:pPr>
       <w:r>
-        <w:t>Sign in with the Microsoft account tied to your Azure free account. If you do not have one yet, create it first at **https://azure.microsoft.com/free** (requires a credit card for identity verification - you are **not** charged; the free account includes USD 200 credit for 30 days plus always-free services).</w:t>
+        <w:t>Sign in with the Microsoft account tied to your Azure free account. If you do not have one yet, create it first at https://azure.microsoft.com/free (requires a credit card for identity verification - you are not charged; the free account includes USD 200 credit for 30 days plus always-free services).</w:t>
       </w:r>
     </w:p>
     <w:p>
@@ -994,7 +1044,7 @@
         <w:pStyle w:val="ListNumber"/>
       </w:pPr>
       <w:r>
-        <w:t>If prompted, complete multi-factor authentication and choose **Yes** on "Stay signed in?" for the duration of the class.</w:t>
+        <w:t>If prompted, complete multi-factor authentication and choose Yes on "Stay signed in?" for the duration of the class.</w:t>
       </w:r>
     </w:p>
     <w:p>
@@ -1044,7 +1094,7 @@
         <w:pStyle w:val="ListNumber"/>
       </w:pPr>
       <w:r>
-        <w:t>Click the **hamburger icon** (☰, top-left) to open the **portal menu**. Note the entries: **Home**, **Dashboard**, **All services**, **All resources**, **Resource groups**, plus favorited services with stars.</w:t>
+        <w:t>Click the hamburger icon (☰, top-left) to open the portal menu. Note the entries: Home, Dashboard, All services, All resources, Resource groups, plus favorited services with stars.</w:t>
       </w:r>
     </w:p>
     <w:p>
@@ -1052,7 +1102,7 @@
         <w:pStyle w:val="ListNumber"/>
       </w:pPr>
       <w:r>
-        <w:t>Click **All services** and browse the categories on the left (Compute, Networking, Storage, Databases, etc.). This is the full Azure service catalogue - 200+ services.</w:t>
+        <w:t>Click All services and browse the categories on the left (Compute, Networking, Storage, Databases, etc.). This is the full Azure service catalogue - 200+ services.</w:t>
       </w:r>
     </w:p>
     <w:p>
@@ -1060,7 +1110,7 @@
         <w:pStyle w:val="ListNumber"/>
       </w:pPr>
       <w:r>
-        <w:t>Hover over **Virtual machines** and click the **star** icon to add it to your favourites in the portal menu.</w:t>
+        <w:t>Hover over Virtual machines and click the star icon to add it to your favourites in the portal menu.</w:t>
       </w:r>
     </w:p>
     <w:p>
@@ -1068,7 +1118,7 @@
         <w:pStyle w:val="ListNumber"/>
       </w:pPr>
       <w:r>
-        <w:t>Click **Home** in the portal menu to return.</w:t>
+        <w:t>Click Home in the portal menu to return.</w:t>
       </w:r>
     </w:p>
     <w:p>
@@ -1092,7 +1142,7 @@
         <w:pStyle w:val="ListNumber"/>
       </w:pPr>
       <w:r>
-        <w:t>Click the **search bar** at the top of the portal (or press **/** or **Ctrl+/** as a shortcut).</w:t>
+        <w:t>Click the search bar at the top of the portal (or press / or Ctrl+/ as a shortcut).</w:t>
       </w:r>
     </w:p>
     <w:p>
@@ -1100,7 +1150,7 @@
         <w:pStyle w:val="ListNumber"/>
       </w:pPr>
       <w:r>
-        <w:t>Type `resource groups` - note results are grouped into **Services**, **Resources**, **Marketplace** and **Documentation**.</w:t>
+        <w:t>Type resource groups - note results are grouped into Services, Resources, Marketplace and Documentation.</w:t>
       </w:r>
     </w:p>
     <w:p>
@@ -1108,7 +1158,7 @@
         <w:pStyle w:val="ListNumber"/>
       </w:pPr>
       <w:r>
-        <w:t>Type `virtual machines` and observe the same grouping, then press **Esc** to close.</w:t>
+        <w:t>Type virtual machines and observe the same grouping, then press Esc to close.</w:t>
       </w:r>
     </w:p>
     <w:p>
@@ -1276,7 +1326,7 @@
         <w:pStyle w:val="ListNumber"/>
       </w:pPr>
       <w:r>
-        <w:t>Click the **gear icon** (Settings) at the top-right.</w:t>
+        <w:t>Click the gear icon (Settings) at the top-right.</w:t>
       </w:r>
     </w:p>
     <w:p>
@@ -1284,7 +1334,7 @@
         <w:pStyle w:val="ListNumber"/>
       </w:pPr>
       <w:r>
-        <w:t>Under **Appearance + startup views**:</w:t>
+        <w:t>Under Appearance + startup views:</w:t>
       </w:r>
     </w:p>
     <w:p>
@@ -1292,7 +1342,7 @@
         <w:pStyle w:val="ListBullet"/>
       </w:pPr>
       <w:r>
-        <w:t>**Choose a theme**: try a dark theme, then set it back to your preference.</w:t>
+        <w:t>Choose a theme: try a dark theme, then set it back to your preference.</w:t>
       </w:r>
     </w:p>
     <w:p>
@@ -1300,7 +1350,7 @@
         <w:pStyle w:val="ListBullet"/>
       </w:pPr>
       <w:r>
-        <w:t>**Startup page**: options are **Home** or **Dashboard** - leave it on **Home**.</w:t>
+        <w:t>Startup page: options are Home or Dashboard - leave it on Home.</w:t>
       </w:r>
     </w:p>
     <w:p>
@@ -1308,7 +1358,7 @@
         <w:pStyle w:val="ListNumber"/>
       </w:pPr>
       <w:r>
-        <w:t>Note the **Language + region** tab (portal display language) and the **Signing out + notifications** tab (inactivity sign-out timeout).</w:t>
+        <w:t>Note the Language + region tab (portal display language) and the Signing out + notifications tab (inactivity sign-out timeout).</w:t>
       </w:r>
     </w:p>
     <w:p>
@@ -1316,7 +1366,7 @@
         <w:pStyle w:val="ListNumber"/>
       </w:pPr>
       <w:r>
-        <w:t>Click **Apply** if you changed anything, then close the Settings pane.</w:t>
+        <w:t>Click Apply if you changed anything, then close the Settings pane.</w:t>
       </w:r>
     </w:p>
     <w:p>
@@ -1332,7 +1382,7 @@
         <w:pStyle w:val="ListNumber"/>
       </w:pPr>
       <w:r>
-        <w:t>In the portal menu (☰), click **Dashboard**. You see the default private dashboard with tiles such as **All resources** and **Quickstarts + tutorials**.</w:t>
+        <w:t>In the portal menu (☰), click Dashboard. You see the default private dashboard with tiles such as All resources and Quickstarts + tutorials.</w:t>
       </w:r>
     </w:p>
     <w:p>
@@ -1340,7 +1390,7 @@
         <w:pStyle w:val="ListNumber"/>
       </w:pPr>
       <w:r>
-        <w:t>Click **Edit** on the dashboard toolbar - a **Tile Gallery** appears. Drag any tile (e.g. **Clock**) onto the canvas, then click **Save**.</w:t>
+        <w:t>Click Edit on the dashboard toolbar - a Tile Gallery appears. Drag any tile (e.g. Clock) onto the canvas, then click Save.</w:t>
       </w:r>
     </w:p>
     <w:p>
@@ -1348,7 +1398,7 @@
         <w:pStyle w:val="ListNumber"/>
       </w:pPr>
       <w:r>
-        <w:t>Now pin a service: search for `Virtual machines` in the global search, open it, and click the **pin icon** () at the top-right of the Virtual machines blade. Choose your dashboard and click **Pin**.</w:t>
+        <w:t>Now pin a service: search for Virtual machines in the global search, open it, and click the pin icon () at the top-right of the Virtual machines blade. Choose your dashboard and click Pin.</w:t>
       </w:r>
     </w:p>
     <w:p>
@@ -1356,7 +1406,7 @@
         <w:pStyle w:val="ListNumber"/>
       </w:pPr>
       <w:r>
-        <w:t>Return to **Dashboard** and confirm the **Virtual machines** tile appears.</w:t>
+        <w:t>Return to Dashboard and confirm the Virtual machines tile appears.</w:t>
       </w:r>
     </w:p>
     <w:p>
@@ -1372,7 +1422,7 @@
         <w:pStyle w:val="Heading2"/>
       </w:pPr>
       <w:r>
-        <w:t>Step 7 - Create the resource group `rg-az900-labs`</w:t>
+        <w:t>Step 7 - Create the resource group rg-az900-labs</w:t>
       </w:r>
     </w:p>
     <w:p>
@@ -1380,7 +1430,7 @@
         <w:pStyle w:val="ListNumber"/>
       </w:pPr>
       <w:r>
-        <w:t>In the global search bar, type `resource groups` and open **Resource groups**.</w:t>
+        <w:t>In the global search bar, type resource groups and open Resource groups.</w:t>
       </w:r>
     </w:p>
     <w:p>
@@ -1388,7 +1438,7 @@
         <w:pStyle w:val="ListNumber"/>
       </w:pPr>
       <w:r>
-        <w:t>Click **+ Create**.</w:t>
+        <w:t>Click + Create.</w:t>
       </w:r>
     </w:p>
     <w:p>
@@ -1396,7 +1446,7 @@
         <w:pStyle w:val="ListNumber"/>
       </w:pPr>
       <w:r>
-        <w:t>On the **Basics** tab enter:</w:t>
+        <w:t>On the Basics tab enter:</w:t>
       </w:r>
     </w:p>
     <w:p>
@@ -1404,7 +1454,7 @@
         <w:pStyle w:val="ListBullet"/>
       </w:pPr>
       <w:r>
-        <w:t>Subscription: your free-account subscription (e.g. `Azure subscription 1` or `Free Trial`)</w:t>
+        <w:t>Subscription: your free-account subscription (e.g. Azure subscription 1 or Free Trial)</w:t>
       </w:r>
     </w:p>
     <w:p>
@@ -1412,7 +1462,7 @@
         <w:pStyle w:val="ListBullet"/>
       </w:pPr>
       <w:r>
-        <w:t>Resource group: `rg-az900-labs`</w:t>
+        <w:t>Resource group: rg-az900-labs</w:t>
       </w:r>
     </w:p>
     <w:p>
@@ -1420,7 +1470,7 @@
         <w:pStyle w:val="ListBullet"/>
       </w:pPr>
       <w:r>
-        <w:t>Region: `Southeast Asia`</w:t>
+        <w:t>Region: Southeast Asia</w:t>
       </w:r>
     </w:p>
     <w:p>
@@ -1428,7 +1478,7 @@
         <w:pStyle w:val="ListNumber"/>
       </w:pPr>
       <w:r>
-        <w:t>Click **Next: Tags**.</w:t>
+        <w:t>Click Next: Tags.</w:t>
       </w:r>
     </w:p>
     <w:p>
@@ -1452,7 +1502,7 @@
         <w:pStyle w:val="ListNumber"/>
       </w:pPr>
       <w:r>
-        <w:t>On the **Tags** tab enter:</w:t>
+        <w:t>On the Tags tab enter:</w:t>
       </w:r>
     </w:p>
     <w:p>
@@ -1460,7 +1510,7 @@
         <w:pStyle w:val="ListBullet"/>
       </w:pPr>
       <w:r>
-        <w:t>Name: `course`</w:t>
+        <w:t>Name: course</w:t>
       </w:r>
     </w:p>
     <w:p>
@@ -1468,7 +1518,7 @@
         <w:pStyle w:val="ListBullet"/>
       </w:pPr>
       <w:r>
-        <w:t>Value: `az900`</w:t>
+        <w:t>Value: az900</w:t>
       </w:r>
     </w:p>
     <w:p>
@@ -1476,7 +1526,7 @@
         <w:pStyle w:val="ListNumber"/>
       </w:pPr>
       <w:r>
-        <w:t>Click **Review + create** - validation runs and shows **Validation passed**.</w:t>
+        <w:t>Click Review + create - validation runs and shows Validation passed.</w:t>
       </w:r>
     </w:p>
     <w:p>
@@ -1484,7 +1534,7 @@
         <w:pStyle w:val="ListNumber"/>
       </w:pPr>
       <w:r>
-        <w:t>Click **Create**. Creation is instant (resource groups contain no billable resources by themselves).</w:t>
+        <w:t>Click Create. Creation is instant (resource groups contain no billable resources by themselves).</w:t>
       </w:r>
     </w:p>
     <w:p>
@@ -1492,7 +1542,7 @@
         <w:pStyle w:val="ListNumber"/>
       </w:pPr>
       <w:r>
-        <w:t>Click the **notifications bell** - you see the "Created resource group" notification.</w:t>
+        <w:t>Click the notifications bell - you see the "Created resource group" notification.</w:t>
       </w:r>
     </w:p>
     <w:p>
@@ -1516,7 +1566,7 @@
         <w:pStyle w:val="ListNumber"/>
       </w:pPr>
       <w:r>
-        <w:t>Open **Resource groups** from the portal menu and confirm `rg-az900-labs` is listed with location **Southeast Asia**.</w:t>
+        <w:t>Open Resource groups from the portal menu and confirm rg-az900-labs is listed with location Southeast Asia.</w:t>
       </w:r>
     </w:p>
     <w:p>
@@ -1524,7 +1574,7 @@
         <w:pStyle w:val="ListNumber"/>
       </w:pPr>
       <w:r>
-        <w:t>Click `rg-az900-labs` to open its **Overview** blade - it shows *No resources to display* for now.</w:t>
+        <w:t>Click rg-az900-labs to open its Overview blade - it shows *No resources to display* for now.</w:t>
       </w:r>
     </w:p>
     <w:p>
@@ -1532,7 +1582,7 @@
         <w:pStyle w:val="ListNumber"/>
       </w:pPr>
       <w:r>
-        <w:t>On the left menu of the resource group, note the blades you will use later: **Access control (IAM)**, **Tags**, **Deployments**, **Locks**.</w:t>
+        <w:t>On the left menu of the resource group, note the blades you will use later: Access control (IAM), Tags, Deployments, Locks.</w:t>
       </w:r>
     </w:p>
     <w:p>
@@ -1540,7 +1590,7 @@
         <w:pStyle w:val="ListNumber"/>
       </w:pPr>
       <w:r>
-        <w:t>Click **Tags** on the left and confirm `course : az900` is present.</w:t>
+        <w:t>Click Tags on the left and confirm course : az900 is present.</w:t>
       </w:r>
     </w:p>
     <w:p>
@@ -1563,7 +1613,7 @@
           <w:b/>
           <w:sz w:val="21"/>
         </w:rPr>
-        <w:t>Keep `rg-az900-labs`</w:t>
+        <w:t>Keep rg-az900-labs</w:t>
       </w:r>
       <w:r>
         <w:rPr>
@@ -1656,7 +1706,7 @@
         <w:pStyle w:val="ListBullet"/>
       </w:pPr>
       <w:r>
-        <w:t>How to apply tags (`course=az900`) for organisation and cost governance.</w:t>
+        <w:t>How to apply tags (course=az900) for organisation and cost governance.</w:t>
       </w:r>
     </w:p>
     <w:p>
@@ -1754,7 +1804,7 @@
         <w:pStyle w:val="ListNumber"/>
       </w:pPr>
       <w:r>
-        <w:t>Go to **https://shell.azure.com** (or in the portal, click the **Cloud Shell icon** `&gt;_` in the top toolbar).</w:t>
+        <w:t>Go to https://shell.azure.com (or in the portal, click the Cloud Shell icon &gt;_ in the top toolbar).</w:t>
       </w:r>
     </w:p>
     <w:p>
@@ -1770,7 +1820,7 @@
         <w:pStyle w:val="ListNumber"/>
       </w:pPr>
       <w:r>
-        <w:t>When asked to choose a shell, select **Bash**.</w:t>
+        <w:t>When asked to choose a shell, select Bash.</w:t>
       </w:r>
     </w:p>
     <w:p>
@@ -1816,7 +1866,7 @@
         <w:pStyle w:val="ListNumber"/>
       </w:pPr>
       <w:r>
-        <w:t>If you see **Getting started** with a **No storage account required** option (ephemeral session), you can pick it for quick tasks - but for this course choose **Mount storage account** so your files survive between sessions.</w:t>
+        <w:t>If you see Getting started with a No storage account required option (ephemeral session), you can pick it for quick tasks - but for this course choose Mount storage account so your files survive between sessions.</w:t>
       </w:r>
     </w:p>
     <w:p>
@@ -1824,7 +1874,7 @@
         <w:pStyle w:val="ListNumber"/>
       </w:pPr>
       <w:r>
-        <w:t>Select your subscription and click **Apply** (or use **Advanced settings** to choose the region `Southeast Asia` and an existing resource group).</w:t>
+        <w:t>Select your subscription and click Apply (or use Advanced settings to choose the region Southeast Asia and an existing resource group).</w:t>
       </w:r>
     </w:p>
     <w:p>
@@ -1832,7 +1882,7 @@
         <w:pStyle w:val="ListNumber"/>
       </w:pPr>
       <w:r>
-        <w:t>Wait for the prompt to appear, e.g. `yourname@Azure:~$`.</w:t>
+        <w:t>Wait for the prompt to appear, e.g. yourname@Azure:~$.</w:t>
       </w:r>
     </w:p>
     <w:p>
@@ -2198,7 +2248,7 @@
         <w:pStyle w:val="ListNumber"/>
       </w:pPr>
       <w:r>
-        <w:t>In the Cloud Shell toolbar, use the shell drop-down (top-left, showing **Bash**) and select **PowerShell** (click **Confirm**). The prompt changes to `PS /home/yourname&gt;`.</w:t>
+        <w:t>In the Cloud Shell toolbar, use the shell drop-down (top-left, showing Bash) and select PowerShell (click Confirm). The prompt changes to PS /home/yourname&gt;.</w:t>
       </w:r>
     </w:p>
     <w:p>
@@ -2302,7 +2352,7 @@
         <w:pStyle w:val="ListNumber"/>
       </w:pPr>
       <w:r>
-        <w:t>Switch back to **Bash** using the same drop-down for the remaining steps.</w:t>
+        <w:t>Switch back to Bash using the same drop-down for the remaining steps.</w:t>
       </w:r>
     </w:p>
     <w:p>
@@ -2497,7 +2547,7 @@
         <w:pStyle w:val="ListNumber"/>
       </w:pPr>
       <w:r>
-        <w:t>In the Cloud Shell toolbar, click the **Manage files** icon (folder/up-down arrows) and choose **Upload**. Pick any small file from your computer - it lands in your Cloud Shell home directory (`ls ~` to verify).</w:t>
+        <w:t>In the Cloud Shell toolbar, click the Manage files icon (folder/up-down arrows) and choose Upload. Pick any small file from your computer - it lands in your Cloud Shell home directory (ls ~ to verify).</w:t>
       </w:r>
     </w:p>
     <w:p>
@@ -2505,7 +2555,7 @@
         <w:pStyle w:val="ListNumber"/>
       </w:pPr>
       <w:r>
-        <w:t>Choose **Manage files** → **Download**, enter the path `az900/notes.txt`, and click **Download** - the browser downloads your file.</w:t>
+        <w:t>Choose Manage files → Download, enter the path az900/notes.txt, and click Download - the browser downloads your file.</w:t>
       </w:r>
     </w:p>
     <w:p>
@@ -2537,7 +2587,7 @@
         <w:pStyle w:val="ListBullet"/>
       </w:pPr>
       <w:r>
-        <w:t>**`rg-az900-labs` is reused by all later labs - do not delete it** (it is removed at the end of the course, Lab 16).</w:t>
+        <w:t>rg-az900-labs is reused by all later labs - do not delete it (it is removed at the end of the course, Lab 16).</w:t>
       </w:r>
     </w:p>
     <w:p>
@@ -2545,7 +2595,7 @@
         <w:pStyle w:val="ListBullet"/>
       </w:pPr>
       <w:r>
-        <w:t>The Cloud Shell storage account is tiny (a few GB of Standard LRS file share) and costs only cents per month; keep it for the rest of the course. If you ever want to remove it after the course, delete the resource group named like `cloud-shell-storage-southeastasia`.</w:t>
+        <w:t>The Cloud Shell storage account is tiny (a few GB of Standard LRS file share) and costs only cents per month; keep it for the rest of the course. If you ever want to remove it after the course, delete the resource group named like cloud-shell-storage-southeastasia.</w:t>
       </w:r>
     </w:p>
     <w:p>
@@ -2589,7 +2639,7 @@
         <w:pStyle w:val="ListBullet"/>
       </w:pPr>
       <w:r>
-        <w:t>Core Azure CLI patterns: `az account show`, `az group list/create/show`, `--query` with JMESPath and `-o table|tsv|json` output formats.</w:t>
+        <w:t>Core Azure CLI patterns: az account show, az group list/create/show, --query with JMESPath and -o table|tsv|json output formats.</w:t>
       </w:r>
     </w:p>
     <w:p>
@@ -2597,7 +2647,7 @@
         <w:pStyle w:val="ListBullet"/>
       </w:pPr>
       <w:r>
-        <w:t>ARM operations are idempotent - re-running `az group create` on an existing group succeeds safely.</w:t>
+        <w:t>ARM operations are idempotent - re-running az group create on an existing group succeeds safely.</w:t>
       </w:r>
     </w:p>
     <w:p>
@@ -2605,7 +2655,7 @@
         <w:pStyle w:val="ListBullet"/>
       </w:pPr>
       <w:r>
-        <w:t>Azure PowerShell (`Get-AzResourceGroup`) and the Azure CLI are equivalent management tools over the same Azure Resource Manager API.</w:t>
+        <w:t>Azure PowerShell (Get-AzResourceGroup) and the Azure CLI are equivalent management tools over the same Azure Resource Manager API.</w:t>
       </w:r>
     </w:p>
     <w:p>
@@ -2613,7 +2663,7 @@
         <w:pStyle w:val="ListBullet"/>
       </w:pPr>
       <w:r>
-        <w:t>The built-in editor (`code`) and upload/download buttons make Cloud Shell a complete lightweight management workstation.</w:t>
+        <w:t>The built-in editor (code) and upload/download buttons make Cloud Shell a complete lightweight management workstation.</w:t>
       </w:r>
     </w:p>
     <w:p>
@@ -2889,7 +2939,7 @@
         <w:pStyle w:val="ListNumber"/>
       </w:pPr>
       <w:r>
-        <w:t>Open **https://datacenters.microsoft.com/globe/explore** in a new browser tab.</w:t>
+        <w:t>Open https://datacenters.microsoft.com/globe/explore in a new browser tab.</w:t>
       </w:r>
     </w:p>
     <w:p>
@@ -2897,7 +2947,7 @@
         <w:pStyle w:val="ListNumber"/>
       </w:pPr>
       <w:r>
-        <w:t>Rotate the 3D globe to Asia and click the **Southeast Asia** region (Singapore). Read the region facts panel - launch year, availability zone support, sustainability info.</w:t>
+        <w:t>Rotate the 3D globe to Asia and click the Southeast Asia region (Singapore). Read the region facts panel - launch year, availability zone support, sustainability info.</w:t>
       </w:r>
     </w:p>
     <w:p>
@@ -2905,7 +2955,7 @@
         <w:pStyle w:val="ListNumber"/>
       </w:pPr>
       <w:r>
-        <w:t>Zoom out and observe how regions cluster into **geographies** (e.g. Asia Pacific, Europe, United States) and how undersea network cables connect them.</w:t>
+        <w:t>Zoom out and observe how regions cluster into geographies (e.g. Asia Pacific, Europe, United States) and how undersea network cables connect them.</w:t>
       </w:r>
     </w:p>
     <w:p>
@@ -2913,7 +2963,7 @@
         <w:pStyle w:val="ListNumber"/>
       </w:pPr>
       <w:r>
-        <w:t>Also open **https://azure.microsoft.com/en-us/explore/global-infrastructure/geographies/** and locate **Singapore** under Asia Pacific - confirm Southeast Asia is listed with availability zones.</w:t>
+        <w:t>Also open https://azure.microsoft.com/en-us/explore/global-infrastructure/geographies/ and locate Singapore under Asia Pacific - confirm Southeast Asia is listed with availability zones.</w:t>
       </w:r>
     </w:p>
     <w:p>
@@ -2963,7 +3013,7 @@
         <w:pStyle w:val="ListNumber"/>
       </w:pPr>
       <w:r>
-        <w:t>From the CLI output in Step 1 (or the geographies page), confirm that **Southeast Asia (Singapore)** is paired with **East Asia (Hong Kong)**.</w:t>
+        <w:t>From the CLI output in Step 1 (or the geographies page), confirm that Southeast Asia (Singapore) is paired with East Asia (Hong Kong).</w:t>
       </w:r>
     </w:p>
     <w:p>
@@ -3166,7 +3216,7 @@
         <w:pStyle w:val="ListNumber"/>
       </w:pPr>
       <w:r>
-        <w:t>Open **https://portal.azure.com**, search `virtual machines`, click **+ Create** → **Azure virtual machine**.</w:t>
+        <w:t>Open https://portal.azure.com, search virtual machines, click + Create → Azure virtual machine.</w:t>
       </w:r>
     </w:p>
     <w:p>
@@ -3174,7 +3224,7 @@
         <w:pStyle w:val="ListNumber"/>
       </w:pPr>
       <w:r>
-        <w:t>On the **Basics** tab set **Region** to `Southeast Asia`, then look at **Availability options** - select **Availability zone** and note you can pick **Zone 1, 2 or 3** (or multiple zones).</w:t>
+        <w:t>On the Basics tab set Region to Southeast Asia, then look at Availability options - select Availability zone and note you can pick Zone 1, 2 or 3 (or multiple zones).</w:t>
       </w:r>
     </w:p>
     <w:p>
@@ -3182,7 +3232,7 @@
         <w:pStyle w:val="ListNumber"/>
       </w:pPr>
       <w:r>
-        <w:t>Change **Region** to a region without zones (e.g. `West Central US`) and observe the availability-zone option disappears.</w:t>
+        <w:t>Change Region to a region without zones (e.g. West Central US) and observe the availability-zone option disappears.</w:t>
       </w:r>
     </w:p>
     <w:p>
@@ -3190,7 +3240,7 @@
         <w:pStyle w:val="ListNumber"/>
       </w:pPr>
       <w:r>
-        <w:t>Click **X** to close the wizard **without creating anything**.</w:t>
+        <w:t>Click X to close the wizard without creating anything.</w:t>
       </w:r>
     </w:p>
     <w:p>
@@ -3214,7 +3264,7 @@
         <w:pStyle w:val="ListNumber"/>
       </w:pPr>
       <w:r>
-        <w:t>Open **https://www.azurespeed.com** in a new tab.</w:t>
+        <w:t>Open https://www.azurespeed.com in a new tab.</w:t>
       </w:r>
     </w:p>
     <w:p>
@@ -3222,7 +3272,7 @@
         <w:pStyle w:val="ListNumber"/>
       </w:pPr>
       <w:r>
-        <w:t>On the **Latency Test** page, tick a handful of regions: `Southeast Asia`, `East Asia`, `Japan East`, `Australia East`, `West Europe`, `East US`.</w:t>
+        <w:t>On the Latency Test page, tick a handful of regions: Southeast Asia, East Asia, Japan East, Australia East, West Europe, East US.</w:t>
       </w:r>
     </w:p>
     <w:p>
@@ -3424,7 +3474,7 @@
         <w:pStyle w:val="ListBullet"/>
       </w:pPr>
       <w:r>
-        <w:t>How to list Azure regions and their paired regions with `az account list-locations` and JMESPath queries.</w:t>
+        <w:t>How to list Azure regions and their paired regions with az account list-locations and JMESPath queries.</w:t>
       </w:r>
     </w:p>
     <w:p>
@@ -3440,7 +3490,7 @@
         <w:pStyle w:val="ListBullet"/>
       </w:pPr>
       <w:r>
-        <w:t>How to check zone support for VM SKUs with `az vm list-skus --zone`.</w:t>
+        <w:t>How to check zone support for VM SKUs with az vm list-skus --zone.</w:t>
       </w:r>
     </w:p>
     <w:p>
@@ -3545,7 +3595,7 @@
         <w:pStyle w:val="ListNumber"/>
       </w:pPr>
       <w:r>
-        <w:t>In the portal search bar, type `virtual machines` and open **Virtual machines**.</w:t>
+        <w:t>In the portal search bar, type virtual machines and open Virtual machines.</w:t>
       </w:r>
     </w:p>
     <w:p>
@@ -3553,7 +3603,7 @@
         <w:pStyle w:val="ListNumber"/>
       </w:pPr>
       <w:r>
-        <w:t>Click **+ Create** → **Azure virtual machine**.</w:t>
+        <w:t>Click + Create → Azure virtual machine.</w:t>
       </w:r>
     </w:p>
     <w:p>
@@ -3561,7 +3611,7 @@
         <w:pStyle w:val="ListNumber"/>
       </w:pPr>
       <w:r>
-        <w:t>On the **Basics** tab set:</w:t>
+        <w:t>On the Basics tab set:</w:t>
       </w:r>
     </w:p>
     <w:p>
@@ -3577,7 +3627,7 @@
         <w:pStyle w:val="ListBullet"/>
       </w:pPr>
       <w:r>
-        <w:t>Resource group: `rg-az900-labs` (click **Create new** and enter it if it doesn't exist)</w:t>
+        <w:t>Resource group: rg-az900-labs (click Create new and enter it if it doesn't exist)</w:t>
       </w:r>
     </w:p>
     <w:p>
@@ -3585,7 +3635,7 @@
         <w:pStyle w:val="ListBullet"/>
       </w:pPr>
       <w:r>
-        <w:t>Virtual machine name: `vm-az900-win01`</w:t>
+        <w:t>Virtual machine name: vm-az900-win01</w:t>
       </w:r>
     </w:p>
     <w:p>
@@ -3593,7 +3643,7 @@
         <w:pStyle w:val="ListBullet"/>
       </w:pPr>
       <w:r>
-        <w:t>Region: `Southeast Asia`</w:t>
+        <w:t>Region: Southeast Asia</w:t>
       </w:r>
     </w:p>
     <w:p>
@@ -3601,7 +3651,7 @@
         <w:pStyle w:val="ListBullet"/>
       </w:pPr>
       <w:r>
-        <w:t>Availability options: `No infrastructure redundancy required`</w:t>
+        <w:t>Availability options: No infrastructure redundancy required</w:t>
       </w:r>
     </w:p>
     <w:p>
@@ -3609,7 +3659,7 @@
         <w:pStyle w:val="ListBullet"/>
       </w:pPr>
       <w:r>
-        <w:t>Security type: `Trusted launch virtual machines` (default)</w:t>
+        <w:t>Security type: Trusted launch virtual machines (default)</w:t>
       </w:r>
     </w:p>
     <w:p>
@@ -3617,7 +3667,7 @@
         <w:pStyle w:val="ListBullet"/>
       </w:pPr>
       <w:r>
-        <w:t>Image: `Windows Server 2022 Datacenter: Azure Edition - x64 Gen2`</w:t>
+        <w:t>Image: Windows Server 2022 Datacenter: Azure Edition - x64 Gen2</w:t>
       </w:r>
     </w:p>
     <w:p>
@@ -3625,7 +3675,7 @@
         <w:pStyle w:val="ListBullet"/>
       </w:pPr>
       <w:r>
-        <w:t>Size: click **See all sizes** and choose `Standard_B2s` (2 vCPUs, 4 GiB RAM - burstable, cheap)</w:t>
+        <w:t>Size: click See all sizes and choose Standard_B2s (2 vCPUs, 4 GiB RAM - burstable, cheap)</w:t>
       </w:r>
     </w:p>
     <w:p>
@@ -3670,7 +3720,7 @@
         <w:pStyle w:val="ListNumber"/>
       </w:pPr>
       <w:r>
-        <w:t>Under **Administrator account**:</w:t>
+        <w:t>Under Administrator account:</w:t>
       </w:r>
     </w:p>
     <w:p>
@@ -3678,7 +3728,7 @@
         <w:pStyle w:val="ListBullet"/>
       </w:pPr>
       <w:r>
-        <w:t>Username: `azureadmin`</w:t>
+        <w:t>Username: azureadmin</w:t>
       </w:r>
     </w:p>
     <w:p>
@@ -3686,7 +3736,7 @@
         <w:pStyle w:val="ListBullet"/>
       </w:pPr>
       <w:r>
-        <w:t>Password: choose a strong password (12+ chars) and **write it down** - Azure never shows it again.</w:t>
+        <w:t>Password: choose a strong password (12+ chars) and write it down - Azure never shows it again.</w:t>
       </w:r>
     </w:p>
     <w:p>
@@ -3694,7 +3744,7 @@
         <w:pStyle w:val="ListNumber"/>
       </w:pPr>
       <w:r>
-        <w:t>Under **Inbound port rules**:</w:t>
+        <w:t>Under Inbound port rules:</w:t>
       </w:r>
     </w:p>
     <w:p>
@@ -3702,7 +3752,7 @@
         <w:pStyle w:val="ListBullet"/>
       </w:pPr>
       <w:r>
-        <w:t>Public inbound ports: `Allow selected ports`</w:t>
+        <w:t>Public inbound ports: Allow selected ports</w:t>
       </w:r>
     </w:p>
     <w:p>
@@ -3710,7 +3760,7 @@
         <w:pStyle w:val="ListBullet"/>
       </w:pPr>
       <w:r>
-        <w:t>Select inbound ports: `RDP (3389)`</w:t>
+        <w:t>Select inbound ports: RDP (3389)</w:t>
       </w:r>
     </w:p>
     <w:p>
@@ -3718,7 +3768,7 @@
         <w:pStyle w:val="ListNumber"/>
       </w:pPr>
       <w:r>
-        <w:t>Under **Licensing**, leave the Azure Hybrid Benefit checkbox unticked.</w:t>
+        <w:t>Under Licensing, leave the Azure Hybrid Benefit checkbox unticked.</w:t>
       </w:r>
     </w:p>
     <w:p>
@@ -3742,7 +3792,7 @@
         <w:pStyle w:val="ListNumber"/>
       </w:pPr>
       <w:r>
-        <w:t>Click **Next: Disks** - note the default **OS disk type**; change it to `Standard SSD (locally-redundant storage)` to keep costs low.</w:t>
+        <w:t>Click Next: Disks - note the default OS disk type; change it to Standard SSD (locally-redundant storage) to keep costs low.</w:t>
       </w:r>
     </w:p>
     <w:p>
@@ -3750,7 +3800,7 @@
         <w:pStyle w:val="ListNumber"/>
       </w:pPr>
       <w:r>
-        <w:t>Click **Next: Networking** - observe that the wizard auto-creates a virtual network (`rg-az900-labs-vnet`), subnet, public IP (`vm-az900-win01-ip`) and NIC network security group with your RDP rule. Set **Delete public IP and NIC when VM is deleted** to checked.</w:t>
+        <w:t>Click Next: Networking - observe that the wizard auto-creates a virtual network (rg-az900-labs-vnet), subnet, public IP (vm-az900-win01-ip) and NIC network security group with your RDP rule. Set Delete public IP and NIC when VM is deleted to checked.</w:t>
       </w:r>
     </w:p>
     <w:p>
@@ -3758,7 +3808,7 @@
         <w:pStyle w:val="ListNumber"/>
       </w:pPr>
       <w:r>
-        <w:t>Click through **Management**, **Monitoring**, **Advanced** - leave defaults.</w:t>
+        <w:t>Click through Management, Monitoring, Advanced - leave defaults.</w:t>
       </w:r>
     </w:p>
     <w:p>
@@ -3766,7 +3816,7 @@
         <w:pStyle w:val="ListNumber"/>
       </w:pPr>
       <w:r>
-        <w:t>Click **Review + create**. Check the **price per hour** shown for `Standard_B2s` and confirm **Validation passed**.</w:t>
+        <w:t>Click Review + create. Check the price per hour shown for Standard_B2s and confirm Validation passed.</w:t>
       </w:r>
     </w:p>
     <w:p>
@@ -3774,7 +3824,7 @@
         <w:pStyle w:val="ListNumber"/>
       </w:pPr>
       <w:r>
-        <w:t>Click **Create**.</w:t>
+        <w:t>Click Create.</w:t>
       </w:r>
     </w:p>
     <w:p>
@@ -3812,7 +3862,7 @@
         <w:pStyle w:val="ListNumber"/>
       </w:pPr>
       <w:r>
-        <w:t>The **Deployment** page opens automatically; watch resources turn green as ARM creates them (~2-3 minutes).</w:t>
+        <w:t>The Deployment page opens automatically; watch resources turn green as ARM creates them (~2-3 minutes).</w:t>
       </w:r>
     </w:p>
     <w:p>
@@ -3820,7 +3870,7 @@
         <w:pStyle w:val="ListNumber"/>
       </w:pPr>
       <w:r>
-        <w:t>Click the **notifications bell** - the same deployment progress appears there.</w:t>
+        <w:t>Click the notifications bell - the same deployment progress appears there.</w:t>
       </w:r>
     </w:p>
     <w:p>
@@ -3828,7 +3878,7 @@
         <w:pStyle w:val="ListNumber"/>
       </w:pPr>
       <w:r>
-        <w:t>When you see **Your deployment is complete**, click **Go to resource** to open the VM's **Overview** blade.</w:t>
+        <w:t>When you see Your deployment is complete, click Go to resource to open the VM's Overview blade.</w:t>
       </w:r>
     </w:p>
     <w:p>
@@ -3836,7 +3886,7 @@
         <w:pStyle w:val="ListNumber"/>
       </w:pPr>
       <w:r>
-        <w:t>Note the **Public IP address** on the Overview - copy it.</w:t>
+        <w:t>Note the Public IP address on the Overview - copy it.</w:t>
       </w:r>
     </w:p>
     <w:p>
@@ -3852,7 +3902,7 @@
         <w:pStyle w:val="ListNumber"/>
       </w:pPr>
       <w:r>
-        <w:t>On the VM's Overview blade, click **Connect** → select **Connect** (or **RDP** → **Download RDP file**).</w:t>
+        <w:t>On the VM's Overview blade, click Connect → select Connect (or RDP → Download RDP file).</w:t>
       </w:r>
     </w:p>
     <w:p>
@@ -3868,7 +3918,7 @@
         <w:pStyle w:val="ListBullet"/>
       </w:pPr>
       <w:r>
-        <w:t>**Windows**: open the downloaded `.rdp` file, or run `mstsc /v:&lt;public-ip&gt;`.</w:t>
+        <w:t>Windows: open the downloaded .rdp file, or run mstsc /v:&lt;public-ip&gt;.</w:t>
       </w:r>
     </w:p>
     <w:p>
@@ -3876,7 +3926,7 @@
         <w:pStyle w:val="ListBullet"/>
       </w:pPr>
       <w:r>
-        <w:t>**macOS**: install **Windows App** (formerly Microsoft Remote Desktop) from the App Store, add a PC with the public IP, and connect.</w:t>
+        <w:t>macOS: install Windows App (formerly Microsoft Remote Desktop) from the App Store, add a PC with the public IP, and connect.</w:t>
       </w:r>
     </w:p>
     <w:p>
@@ -3884,7 +3934,7 @@
         <w:pStyle w:val="ListNumber"/>
       </w:pPr>
       <w:r>
-        <w:t>Sign in as `azureadmin` with your password. Accept the certificate warning (it's a self-signed cert for the lab VM).</w:t>
+        <w:t>Sign in as azureadmin with your password. Accept the certificate warning (it's a self-signed cert for the lab VM).</w:t>
       </w:r>
     </w:p>
     <w:p>
@@ -3916,7 +3966,7 @@
         <w:pStyle w:val="ListNumber"/>
       </w:pPr>
       <w:r>
-        <w:t>Inside the RDP session, right-click **Start** → **Windows PowerShell (Admin)** (or **Terminal (Admin)**).</w:t>
+        <w:t>Inside the RDP session, right-click Start → Windows PowerShell (Admin) (or Terminal (Admin)).</w:t>
       </w:r>
     </w:p>
     <w:p>
@@ -3966,7 +4016,7 @@
         <w:pStyle w:val="ListNumber"/>
       </w:pPr>
       <w:r>
-        <w:t>Verify locally: open **Microsoft Edge** inside the VM and browse to `http://localhost` - the blue IIS welcome page appears.</w:t>
+        <w:t>Verify locally: open Microsoft Edge inside the VM and browse to http://localhost - the blue IIS welcome page appears.</w:t>
       </w:r>
     </w:p>
     <w:p>
@@ -3998,7 +4048,7 @@
         <w:pStyle w:val="ListNumber"/>
       </w:pPr>
       <w:r>
-        <w:t>Back in the portal, on the VM's left menu open **Networking** → **Network settings**.</w:t>
+        <w:t>Back in the portal, on the VM's left menu open Networking → Network settings.</w:t>
       </w:r>
     </w:p>
     <w:p>
@@ -4006,7 +4056,7 @@
         <w:pStyle w:val="ListNumber"/>
       </w:pPr>
       <w:r>
-        <w:t>Under **Rules**, click **+ Create port rule** → **Inbound port rule** and set:</w:t>
+        <w:t>Under Rules, click + Create port rule → Inbound port rule and set:</w:t>
       </w:r>
     </w:p>
     <w:p>
@@ -4014,7 +4064,7 @@
         <w:pStyle w:val="ListBullet"/>
       </w:pPr>
       <w:r>
-        <w:t>Source: `Any`</w:t>
+        <w:t>Source: Any</w:t>
       </w:r>
     </w:p>
     <w:p>
@@ -4022,7 +4072,7 @@
         <w:pStyle w:val="ListBullet"/>
       </w:pPr>
       <w:r>
-        <w:t>Source port ranges: `*`</w:t>
+        <w:t>Source port ranges: *</w:t>
       </w:r>
     </w:p>
     <w:p>
@@ -4030,7 +4080,7 @@
         <w:pStyle w:val="ListBullet"/>
       </w:pPr>
       <w:r>
-        <w:t>Destination: `Any`</w:t>
+        <w:t>Destination: Any</w:t>
       </w:r>
     </w:p>
     <w:p>
@@ -4038,7 +4088,7 @@
         <w:pStyle w:val="ListBullet"/>
       </w:pPr>
       <w:r>
-        <w:t>Service: `HTTP` (sets Destination port `80`, Protocol `TCP`)</w:t>
+        <w:t>Service: HTTP (sets Destination port 80, Protocol TCP)</w:t>
       </w:r>
     </w:p>
     <w:p>
@@ -4046,7 +4096,7 @@
         <w:pStyle w:val="ListBullet"/>
       </w:pPr>
       <w:r>
-        <w:t>Action: `Allow`</w:t>
+        <w:t>Action: Allow</w:t>
       </w:r>
     </w:p>
     <w:p>
@@ -4054,7 +4104,7 @@
         <w:pStyle w:val="ListBullet"/>
       </w:pPr>
       <w:r>
-        <w:t>Priority: `1010`</w:t>
+        <w:t>Priority: 1010</w:t>
       </w:r>
     </w:p>
     <w:p>
@@ -4062,7 +4112,7 @@
         <w:pStyle w:val="ListBullet"/>
       </w:pPr>
       <w:r>
-        <w:t>Name: `Allow-HTTP-80`</w:t>
+        <w:t>Name: Allow-HTTP-80</w:t>
       </w:r>
     </w:p>
     <w:p>
@@ -4070,7 +4120,7 @@
         <w:pStyle w:val="ListNumber"/>
       </w:pPr>
       <w:r>
-        <w:t>Click **Add** and wait for the "Created security rule" notification.</w:t>
+        <w:t>Click Add and wait for the "Created security rule" notification.</w:t>
       </w:r>
     </w:p>
     <w:p>
@@ -4094,7 +4144,7 @@
         <w:pStyle w:val="ListNumber"/>
       </w:pPr>
       <w:r>
-        <w:t>On your **own laptop's** browser (not inside the VM), go to `http://&lt;public-ip&gt;` using the IP copied in Step 4.</w:t>
+        <w:t>On your own laptop's browser (not inside the VM), go to http://&lt;public-ip&gt; using the IP copied in Step 4.</w:t>
       </w:r>
     </w:p>
     <w:p>
@@ -4102,7 +4152,7 @@
         <w:pStyle w:val="ListNumber"/>
       </w:pPr>
       <w:r>
-        <w:t>The default **IIS Windows Server** welcome page loads.</w:t>
+        <w:t>The default IIS Windows Server welcome page loads.</w:t>
       </w:r>
     </w:p>
     <w:p>
@@ -4134,7 +4184,7 @@
         <w:pStyle w:val="ListNumber"/>
       </w:pPr>
       <w:r>
-        <w:t>On the VM's **Overview** blade, click **Stop** and confirm. (Optionally leave "reserve public IP" unticked.)</w:t>
+        <w:t>On the VM's Overview blade, click Stop and confirm. (Optionally leave "reserve public IP" unticked.)</w:t>
       </w:r>
     </w:p>
     <w:p>
@@ -4142,7 +4192,7 @@
         <w:pStyle w:val="ListNumber"/>
       </w:pPr>
       <w:r>
-        <w:t>Watch the **Status** field change: `Stopping` → **`Stopped (deallocated)`**.</w:t>
+        <w:t>Watch the Status field change: Stopping → Stopped (deallocated).</w:t>
       </w:r>
     </w:p>
     <w:p>
@@ -4150,7 +4200,7 @@
         <w:pStyle w:val="ListNumber"/>
       </w:pPr>
       <w:r>
-        <w:t>Key observation: **Stopped (deallocated)** means the compute hardware is released back to Azure and **you stop paying for the VM's compute time**. You still pay small charges for the OS disk (storage) and any static public IP. Shutting down from inside Windows only reaches `Stopped` - still billed; always stop from the portal/CLI to deallocate.</w:t>
+        <w:t>Key observation: Stopped (deallocated) means the compute hardware is released back to Azure and you stop paying for the VM's compute time. You still pay small charges for the OS disk (storage) and any static public IP. Shutting down from inside Windows only reaches Stopped - still billed; always stop from the portal/CLI to deallocate.</w:t>
       </w:r>
     </w:p>
     <w:p>
@@ -4209,7 +4259,7 @@
         <w:pStyle w:val="ListNumber"/>
       </w:pPr>
       <w:r>
-        <w:t>Open **Virtual machines** → `vm-az900-win01` → **Delete**.</w:t>
+        <w:t>Open Virtual machines → vm-az900-win01 → Delete.</w:t>
       </w:r>
     </w:p>
     <w:p>
@@ -4217,7 +4267,7 @@
         <w:pStyle w:val="ListNumber"/>
       </w:pPr>
       <w:r>
-        <w:t>In the delete pane, tick the checkboxes to also delete the **OS disk**, **Network interface** and **Public IP address**, then confirm.</w:t>
+        <w:t>In the delete pane, tick the checkboxes to also delete the OS disk, Network interface and Public IP address, then confirm.</w:t>
       </w:r>
     </w:p>
     <w:p>
@@ -4225,7 +4275,7 @@
         <w:pStyle w:val="ListNumber"/>
       </w:pPr>
       <w:r>
-        <w:t>**Do not delete the resource group `rg-az900-labs`** - it is reused by every remaining lab (deleted only in Lab 16).</w:t>
+        <w:t>Do not delete the resource group rg-az900-labs - it is reused by every remaining lab (deleted only in Lab 16).</w:t>
       </w:r>
     </w:p>
     <w:p>
@@ -4249,7 +4299,7 @@
         <w:pStyle w:val="ListBullet"/>
       </w:pPr>
       <w:r>
-        <w:t>How to size a VM for cost (`Standard_B2s` burstable) and connect over RDP from Windows (mstsc) or macOS (Windows App).</w:t>
+        <w:t>How to size a VM for cost (Standard_B2s burstable) and connect over RDP from Windows (mstsc) or macOS (Windows App).</w:t>
       </w:r>
     </w:p>
     <w:p>
@@ -4257,7 +4307,7 @@
         <w:pStyle w:val="ListBullet"/>
       </w:pPr>
       <w:r>
-        <w:t>Shared responsibility: Azure runs the host; you install and manage the OS workload (IIS via `Install-WindowsFeature`).</w:t>
+        <w:t>Shared responsibility: Azure runs the host; you install and manage the OS workload (IIS via Install-WindowsFeature).</w:t>
       </w:r>
     </w:p>
     <w:p>
@@ -4273,7 +4323,7 @@
         <w:pStyle w:val="ListBullet"/>
       </w:pPr>
       <w:r>
-        <w:t>`Stopped (deallocated)` releases compute and stops compute billing (disks and static IPs still bill) - a key cost-management behaviour on the AZ-900 exam.</w:t>
+        <w:t>Stopped (deallocated) releases compute and stops compute billing (disks and static IPs still bill) - a key cost-management behaviour on the AZ-900 exam.</w:t>
       </w:r>
     </w:p>
     <w:p>
@@ -5020,7 +5070,7 @@
           <w:b/>
           <w:sz w:val="21"/>
         </w:rPr>
-        <w:t>Keep the resource group `rg-az900-labs`</w:t>
+        <w:t>Keep the resource group rg-az900-labs</w:t>
       </w:r>
       <w:r>
         <w:rPr>
@@ -5042,7 +5092,7 @@
         <w:pStyle w:val="ListBullet"/>
       </w:pPr>
       <w:r>
-        <w:t>One `az vm create` command provisions a complete IaaS stack - VM, VNet, NIC, public IP, NSG - with sensible defaults and SSH keys via `--generate-ssh-keys`.</w:t>
+        <w:t>One az vm create command provisions a complete IaaS stack - VM, VNet, NIC, public IP, NSG - with sensible defaults and SSH keys via --generate-ssh-keys.</w:t>
       </w:r>
     </w:p>
     <w:p>
@@ -5050,7 +5100,7 @@
         <w:pStyle w:val="ListBullet"/>
       </w:pPr>
       <w:r>
-        <w:t>`az vm open-port` is the CLI shortcut for adding an NSG inbound rule.</w:t>
+        <w:t>az vm open-port is the CLI shortcut for adding an NSG inbound rule.</w:t>
       </w:r>
     </w:p>
     <w:p>
@@ -5058,7 +5108,7 @@
         <w:pStyle w:val="ListBullet"/>
       </w:pPr>
       <w:r>
-        <w:t>Managing a Linux VM end to end: SSH from Cloud Shell, `apt install nginx`, and verifying with `curl` inside and outside the VM.</w:t>
+        <w:t>Managing a Linux VM end to end: SSH from Cloud Shell, apt install nginx, and verifying with curl inside and outside the VM.</w:t>
       </w:r>
     </w:p>
     <w:p>
@@ -5066,7 +5116,7 @@
         <w:pStyle w:val="ListBullet"/>
       </w:pPr>
       <w:r>
-        <w:t>`az vm show --show-details --query powerState` distinguishes `VM running` from `VM deallocated` (no compute charges).</w:t>
+        <w:t>az vm show --show-details --query powerState distinguishes VM running from VM deallocated (no compute charges).</w:t>
       </w:r>
     </w:p>
     <w:p>
@@ -5074,7 +5124,7 @@
         <w:pStyle w:val="ListBullet"/>
       </w:pPr>
       <w:r>
-        <w:t>`az vm delete` leaves orphaned NICs, IPs and disks that still cost money - clean them up explicitly, or use the portal's "Delete with VM" checkboxes.</w:t>
+        <w:t>az vm delete leaves orphaned NICs, IPs and disks that still cost money - clean them up explicitly, or use the portal's "Delete with VM" checkboxes.</w:t>
       </w:r>
     </w:p>
     <w:p>
@@ -5150,7 +5200,7 @@
         <w:pStyle w:val="ListNumber"/>
       </w:pPr>
       <w:r>
-        <w:t>In the portal search bar, type **Resource groups** and open it.</w:t>
+        <w:t>In the portal search bar, type Resource groups and open it.</w:t>
       </w:r>
     </w:p>
     <w:p>
@@ -5158,7 +5208,7 @@
         <w:pStyle w:val="ListNumber"/>
       </w:pPr>
       <w:r>
-        <w:t>Click **+ Create** and fill in:</w:t>
+        <w:t>Click + Create and fill in:</w:t>
       </w:r>
     </w:p>
     <w:p>
@@ -5174,7 +5224,7 @@
         <w:pStyle w:val="ListBullet"/>
       </w:pPr>
       <w:r>
-        <w:t>Resource group: `rg-az900-labs`</w:t>
+        <w:t>Resource group: rg-az900-labs</w:t>
       </w:r>
     </w:p>
     <w:p>
@@ -5182,7 +5232,7 @@
         <w:pStyle w:val="ListBullet"/>
       </w:pPr>
       <w:r>
-        <w:t>Region: `Southeast Asia`</w:t>
+        <w:t>Region: Southeast Asia</w:t>
       </w:r>
     </w:p>
     <w:p>
@@ -5190,7 +5240,7 @@
         <w:pStyle w:val="ListNumber"/>
       </w:pPr>
       <w:r>
-        <w:t>Click **Review + create** → **Create**. (Skip this step if `rg-az900-labs` already exists from an earlier lab.)</w:t>
+        <w:t>Click Review + create → Create. (Skip this step if rg-az900-labs already exists from an earlier lab.)</w:t>
       </w:r>
     </w:p>
     <w:p>
@@ -5214,7 +5264,7 @@
         <w:pStyle w:val="ListNumber"/>
       </w:pPr>
       <w:r>
-        <w:t>Click **Create a resource** (top-left menu) → search **Web App** → **Create** → **Web App**.</w:t>
+        <w:t>Click Create a resource (top-left menu) → search Web App → Create → Web App.</w:t>
       </w:r>
     </w:p>
     <w:p>
@@ -5222,7 +5272,7 @@
         <w:pStyle w:val="ListNumber"/>
       </w:pPr>
       <w:r>
-        <w:t>On the **Basics** tab enter:</w:t>
+        <w:t>On the Basics tab enter:</w:t>
       </w:r>
     </w:p>
     <w:p>
@@ -5414,7 +5464,7 @@
         <w:pStyle w:val="ListNumber"/>
       </w:pPr>
       <w:r>
-        <w:t>Under **Pricing plans**, click **Create new** for the Linux Plan, name it `plan-az900-free`, then click **Explore pricing plans** and select **Free F1** → **Select**.</w:t>
+        <w:t>Under Pricing plans, click Create new for the Linux Plan, name it plan-az900-free, then click Explore pricing plans and select Free F1 → Select.</w:t>
       </w:r>
     </w:p>
     <w:p>
@@ -5422,7 +5472,7 @@
         <w:pStyle w:val="ListNumber"/>
       </w:pPr>
       <w:r>
-        <w:t>Click **Review + create** → **Create** and wait for deployment (about 1 minute).</w:t>
+        <w:t>Click Review + create → Create and wait for deployment (about 1 minute).</w:t>
       </w:r>
     </w:p>
     <w:p>
@@ -5460,7 +5510,7 @@
         <w:pStyle w:val="ListNumber"/>
       </w:pPr>
       <w:r>
-        <w:t>When deployment completes, click **Go to resource**.</w:t>
+        <w:t>When deployment completes, click Go to resource.</w:t>
       </w:r>
     </w:p>
     <w:p>
@@ -5468,7 +5518,7 @@
         <w:pStyle w:val="ListNumber"/>
       </w:pPr>
       <w:r>
-        <w:t>On the **Overview** blade, find **Default domain** and click the `https://app-az900-....azurewebsites.net` link.</w:t>
+        <w:t>On the Overview blade, find Default domain and click the https://app-az900-....azurewebsites.net link.</w:t>
       </w:r>
     </w:p>
     <w:p>
@@ -5500,7 +5550,7 @@
         <w:pStyle w:val="ListNumber"/>
       </w:pPr>
       <w:r>
-        <w:t>Click the **Cloud Shell** icon (&gt;_) in the top toolbar of the portal and choose **Bash** (create storage if prompted, accept defaults).</w:t>
+        <w:t>Click the Cloud Shell icon (&gt;_) in the top toolbar of the portal and choose Bash (create storage if prompted, accept defaults).</w:t>
       </w:r>
     </w:p>
     <w:p>
@@ -5508,7 +5558,7 @@
         <w:pStyle w:val="ListNumber"/>
       </w:pPr>
       <w:r>
-        <w:t>Create a folder and an `index.html`:</w:t>
+        <w:t>Create a folder and an index.html:</w:t>
       </w:r>
     </w:p>
     <w:p>
@@ -5566,7 +5616,7 @@
         <w:pStyle w:val="ListNumber"/>
       </w:pPr>
       <w:r>
-        <w:t>Save with **Ctrl+S** and close the editor with **Ctrl+Q**.</w:t>
+        <w:t>Save with Ctrl+S and close the editor with Ctrl+Q.</w:t>
       </w:r>
     </w:p>
     <w:p>
@@ -5698,7 +5748,7 @@
         <w:pStyle w:val="ListNumber"/>
       </w:pPr>
       <w:r>
-        <w:t>On your web app's left menu, under **Settings**, click **Scale up (App Service plan)**.</w:t>
+        <w:t>On your web app's left menu, under Settings, click Scale up (App Service plan).</w:t>
       </w:r>
     </w:p>
     <w:p>
@@ -5706,7 +5756,7 @@
         <w:pStyle w:val="ListNumber"/>
       </w:pPr>
       <w:r>
-        <w:t>Browse the tiers: **Dev/Test** (F1, B1), **Production** (P0v3, P1v3...). Note what higher tiers add: custom domains + TLS, staging slots, autoscale, more CPU/RAM.</w:t>
+        <w:t>Browse the tiers: Dev/Test (F1, B1), Production (P0v3, P1v3...). Note what higher tiers add: custom domains + TLS, staging slots, autoscale, more CPU/RAM.</w:t>
       </w:r>
     </w:p>
     <w:p>
@@ -5714,7 +5764,7 @@
         <w:pStyle w:val="ListNumber"/>
       </w:pPr>
       <w:r>
-        <w:t>**Do NOT change the tier** - stay on F1. Close the blade without applying.</w:t>
+        <w:t>Do NOT change the tier - stay on F1. Close the blade without applying.</w:t>
       </w:r>
     </w:p>
     <w:p>
@@ -5751,7 +5801,7 @@
         <w:pStyle w:val="ListNumber"/>
       </w:pPr>
       <w:r>
-        <w:t>Under **Settings**, click **Scale out (App Service plan)**.</w:t>
+        <w:t>Under Settings, click Scale out (App Service plan).</w:t>
       </w:r>
     </w:p>
     <w:p>
@@ -5767,7 +5817,7 @@
         <w:pStyle w:val="ListNumber"/>
       </w:pPr>
       <w:r>
-        <w:t>**Do NOT scale** - just note that on Standard and above you could set autoscale rules (e.g. add an instance when CPU &gt; 70%).</w:t>
+        <w:t>Do NOT scale - just note that on Standard and above you could set autoscale rules (e.g. add an instance when CPU &gt; 70%).</w:t>
       </w:r>
     </w:p>
     <w:p>
@@ -5883,7 +5933,7 @@
         <w:pStyle w:val="ListBullet"/>
       </w:pPr>
       <w:r>
-        <w:t>App Service is **PaaS**: Azure manages the OS, web server, patching, and TLS - you manage only your code (shared responsibility model).</w:t>
+        <w:t>App Service is PaaS: Azure manages the OS, web server, patching, and TLS - you manage only your code (shared responsibility model).</w:t>
       </w:r>
     </w:p>
     <w:p>
@@ -5891,7 +5941,7 @@
         <w:pStyle w:val="ListBullet"/>
       </w:pPr>
       <w:r>
-        <w:t>An **App Service plan** defines the compute (tier, size, region) that one or more web apps run on.</w:t>
+        <w:t>An App Service plan defines the compute (tier, size, region) that one or more web apps run on.</w:t>
       </w:r>
     </w:p>
     <w:p>
@@ -5899,7 +5949,7 @@
         <w:pStyle w:val="ListBullet"/>
       </w:pPr>
       <w:r>
-        <w:t>Zip deploy via `az webapp deploy` is a simple, repeatable way to publish code to App Service.</w:t>
+        <w:t>Zip deploy via az webapp deploy is a simple, repeatable way to publish code to App Service.</w:t>
       </w:r>
     </w:p>
     <w:p>
@@ -5907,7 +5957,7 @@
         <w:pStyle w:val="ListBullet"/>
       </w:pPr>
       <w:r>
-        <w:t>**Scale up** = bigger instances (vertical); **scale out** = more instances (horizontal); higher tiers unlock autoscale.</w:t>
+        <w:t>Scale up = bigger instances (vertical); scale out = more instances (horizontal); higher tiers unlock autoscale.</w:t>
       </w:r>
     </w:p>
     <w:p>
@@ -5915,7 +5965,7 @@
         <w:pStyle w:val="ListBullet"/>
       </w:pPr>
       <w:r>
-        <w:t>App names must be globally unique because they form part of the public `*.azurewebsites.net` DNS name.</w:t>
+        <w:t>App names must be globally unique because they form part of the public *.azurewebsites.net DNS name.</w:t>
       </w:r>
     </w:p>
     <w:p>
@@ -6493,7 +6543,7 @@
         <w:pStyle w:val="ListBullet"/>
       </w:pPr>
       <w:r>
-        <w:t>**Azure Container Instances** runs containers on demand with no VMs or orchestrator to manage - the fastest way to run a container in Azure.</w:t>
+        <w:t>Azure Container Instances runs containers on demand with no VMs or orchestrator to manage - the fastest way to run a container in Azure.</w:t>
       </w:r>
     </w:p>
     <w:p>
@@ -6501,7 +6551,7 @@
         <w:pStyle w:val="ListBullet"/>
       </w:pPr>
       <w:r>
-        <w:t>Containers start in **seconds** because they share the host OS kernel instead of booting their own, giving higher density than VMs.</w:t>
+        <w:t>Containers start in seconds because they share the host OS kernel instead of booting their own, giving higher density than VMs.</w:t>
       </w:r>
     </w:p>
     <w:p>
@@ -6509,7 +6559,7 @@
         <w:pStyle w:val="ListBullet"/>
       </w:pPr>
       <w:r>
-        <w:t>A `--dns-name-label` gives a container group a public FQDN of the form `&lt;label&gt;.&lt;region&gt;.azurecontainer.io`.</w:t>
+        <w:t>A --dns-name-label gives a container group a public FQDN of the form &lt;label&gt;.&lt;region&gt;.azurecontainer.io.</w:t>
       </w:r>
     </w:p>
     <w:p>
@@ -6517,7 +6567,7 @@
         <w:pStyle w:val="ListBullet"/>
       </w:pPr>
       <w:r>
-        <w:t>`az container logs` replaces SSH for troubleshooting - you observe the app, not a server.</w:t>
+        <w:t>az container logs replaces SSH for troubleshooting - you observe the app, not a server.</w:t>
       </w:r>
     </w:p>
     <w:p>
@@ -6525,7 +6575,7 @@
         <w:pStyle w:val="ListBullet"/>
       </w:pPr>
       <w:r>
-        <w:t>Choosing between **IaaS (VMs), containers, and PaaS** is about how much of the stack you want to manage - a core AZ-900 exam theme.</w:t>
+        <w:t>Choosing between IaaS (VMs), containers, and PaaS is about how much of the stack you want to manage - a core AZ-900 exam theme.</w:t>
       </w:r>
     </w:p>
     <w:p>
@@ -6729,7 +6779,7 @@
         <w:pStyle w:val="ListNumber"/>
       </w:pPr>
       <w:r>
-        <w:t>In the portal search bar, type **Virtual networks** and open **vnet-az900**.</w:t>
+        <w:t>In the portal search bar, type Virtual networks and open vnet-az900.</w:t>
       </w:r>
     </w:p>
     <w:p>
@@ -6737,7 +6787,7 @@
         <w:pStyle w:val="ListNumber"/>
       </w:pPr>
       <w:r>
-        <w:t>On the left menu click **Settings → Subnets** and confirm:</w:t>
+        <w:t>On the left menu click Settings → Subnets and confirm:</w:t>
       </w:r>
     </w:p>
     <w:p>
@@ -7204,7 +7254,7 @@
         <w:pStyle w:val="ListNumber"/>
       </w:pPr>
       <w:r>
-        <w:t>In the portal, search **Network security groups** and open **vm-az900-webNSG** (created automatically with the VM).</w:t>
+        <w:t>In the portal, search Network security groups and open vm-az900-webNSG (created automatically with the VM).</w:t>
       </w:r>
     </w:p>
     <w:p>
@@ -7212,7 +7262,7 @@
         <w:pStyle w:val="ListNumber"/>
       </w:pPr>
       <w:r>
-        <w:t>Click **Settings → Inbound security rules** and observe the default rules at priority 65000+:</w:t>
+        <w:t>Click Settings → Inbound security rules and observe the default rules at priority 65000+:</w:t>
       </w:r>
     </w:p>
     <w:p>
@@ -7220,7 +7270,7 @@
         <w:pStyle w:val="ListBullet"/>
       </w:pPr>
       <w:r>
-        <w:t>`AllowVnetInBound` - traffic within the VNet is allowed (this is why the ping worked).</w:t>
+        <w:t>AllowVnetInBound - traffic within the VNet is allowed (this is why the ping worked).</w:t>
       </w:r>
     </w:p>
     <w:p>
@@ -7228,7 +7278,7 @@
         <w:pStyle w:val="ListBullet"/>
       </w:pPr>
       <w:r>
-        <w:t>`AllowAzureLoadBalancerInBound` - health probes allowed.</w:t>
+        <w:t>AllowAzureLoadBalancerInBound - health probes allowed.</w:t>
       </w:r>
     </w:p>
     <w:p>
@@ -7236,7 +7286,7 @@
         <w:pStyle w:val="ListBullet"/>
       </w:pPr>
       <w:r>
-        <w:t>`DenyAllInBound` - everything else from the internet is denied.</w:t>
+        <w:t>DenyAllInBound - everything else from the internet is denied.</w:t>
       </w:r>
     </w:p>
     <w:p>
@@ -7244,7 +7294,7 @@
         <w:pStyle w:val="ListNumber"/>
       </w:pPr>
       <w:r>
-        <w:t>Note the higher-priority rule allowing SSH (port 22) that `az vm create` added for the web VM.</w:t>
+        <w:t>Note the higher-priority rule allowing SSH (port 22) that az vm create added for the web VM.</w:t>
       </w:r>
     </w:p>
     <w:p>
@@ -7276,7 +7326,7 @@
         <w:pStyle w:val="ListBullet"/>
       </w:pPr>
       <w:r>
-        <w:t>`vm-az900-web`'s public IP is a **public endpoint**: reachable from the internet, protected only by NSG rules.</w:t>
+        <w:t>vm-az900-web's public IP is a public endpoint: reachable from the internet, protected only by NSG rules.</w:t>
       </w:r>
     </w:p>
     <w:p>
@@ -7284,7 +7334,7 @@
         <w:pStyle w:val="ListBullet"/>
       </w:pPr>
       <w:r>
-        <w:t>`vm-az900-db`'s private IP is effectively a **private endpoint** pattern: services (like Azure SQL or Storage) can likewise be given a private IP inside your VNet via **Azure Private Link**, so traffic never crosses the public internet.</w:t>
+        <w:t>vm-az900-db's private IP is effectively a private endpoint pattern: services (like Azure SQL or Storage) can likewise be given a private IP inside your VNet via Azure Private Link, so traffic never crosses the public internet.</w:t>
       </w:r>
     </w:p>
     <w:p>
@@ -7394,7 +7444,7 @@
         <w:pStyle w:val="ListBullet"/>
       </w:pPr>
       <w:r>
-        <w:t>An **Azure Virtual Network** is your private IP space in the cloud; **subnets** segment it by tier or workload.</w:t>
+        <w:t>An Azure Virtual Network is your private IP space in the cloud; subnets segment it by tier or workload.</w:t>
       </w:r>
     </w:p>
     <w:p>
@@ -7402,7 +7452,7 @@
         <w:pStyle w:val="ListBullet"/>
       </w:pPr>
       <w:r>
-        <w:t>VMs in different subnets of the same VNet communicate automatically over **private IPs** - no extra routing needed.</w:t>
+        <w:t>VMs in different subnets of the same VNet communicate automatically over private IPs - no extra routing needed.</w:t>
       </w:r>
     </w:p>
     <w:p>
@@ -7410,7 +7460,7 @@
         <w:pStyle w:val="ListBullet"/>
       </w:pPr>
       <w:r>
-        <w:t>A VM (or service) **without a public IP** is unreachable from the internet - a fundamental security control.</w:t>
+        <w:t>A VM (or service) without a public IP is unreachable from the internet - a fundamental security control.</w:t>
       </w:r>
     </w:p>
     <w:p>
@@ -7418,7 +7468,7 @@
         <w:pStyle w:val="ListBullet"/>
       </w:pPr>
       <w:r>
-        <w:t>**NSG default rules** allow intra-VNet traffic and deny all other inbound traffic; rules are evaluated by priority.</w:t>
+        <w:t>NSG default rules allow intra-VNet traffic and deny all other inbound traffic; rules are evaluated by priority.</w:t>
       </w:r>
     </w:p>
     <w:p>
@@ -7426,7 +7476,7 @@
         <w:pStyle w:val="ListBullet"/>
       </w:pPr>
       <w:r>
-        <w:t>**Public endpoints** expose services to the internet; **private endpoints/Private Link** keep service traffic inside your VNet.</w:t>
+        <w:t>Public endpoints expose services to the internet; private endpoints/Private Link keep service traffic inside your VNet.</w:t>
       </w:r>
     </w:p>
     <w:p>
@@ -7502,7 +7552,7 @@
         <w:pStyle w:val="ListNumber"/>
       </w:pPr>
       <w:r>
-        <w:t>Click **Create a resource** → search **Storage account** → **Create**.</w:t>
+        <w:t>Click Create a resource → search Storage account → Create.</w:t>
       </w:r>
     </w:p>
     <w:p>
@@ -7510,7 +7560,7 @@
         <w:pStyle w:val="ListNumber"/>
       </w:pPr>
       <w:r>
-        <w:t>On the **Basics** tab enter:</w:t>
+        <w:t>On the Basics tab enter:</w:t>
       </w:r>
     </w:p>
     <w:p>
@@ -7679,7 +7729,7 @@
         <w:pStyle w:val="ListNumber"/>
       </w:pPr>
       <w:r>
-        <w:t>Leave all other tabs at defaults, click **Review + create** → **Create**, then **Go to resource**.</w:t>
+        <w:t>Leave all other tabs at defaults, click Review + create → Create, then Go to resource.</w:t>
       </w:r>
     </w:p>
     <w:p>
@@ -7703,7 +7753,7 @@
         <w:pStyle w:val="ListNumber"/>
       </w:pPr>
       <w:r>
-        <w:t>On the storage account's left menu, click **Data storage → Containers**.</w:t>
+        <w:t>On the storage account's left menu, click Data storage → Containers.</w:t>
       </w:r>
     </w:p>
     <w:p>
@@ -7711,7 +7761,7 @@
         <w:pStyle w:val="ListNumber"/>
       </w:pPr>
       <w:r>
-        <w:t>Click **+ Container** and enter:</w:t>
+        <w:t>Click + Container and enter:</w:t>
       </w:r>
     </w:p>
     <w:p>
@@ -7719,7 +7769,7 @@
         <w:pStyle w:val="ListBullet"/>
       </w:pPr>
       <w:r>
-        <w:t>Name: `labfiles`</w:t>
+        <w:t>Name: labfiles</w:t>
       </w:r>
     </w:p>
     <w:p>
@@ -7727,7 +7777,7 @@
         <w:pStyle w:val="ListBullet"/>
       </w:pPr>
       <w:r>
-        <w:t>Anonymous access level: `Private (no anonymous access)`</w:t>
+        <w:t>Anonymous access level: Private (no anonymous access)</w:t>
       </w:r>
     </w:p>
     <w:p>
@@ -7735,7 +7785,7 @@
         <w:pStyle w:val="ListNumber"/>
       </w:pPr>
       <w:r>
-        <w:t>Click **Create**.</w:t>
+        <w:t>Click Create.</w:t>
       </w:r>
     </w:p>
     <w:p>
@@ -7759,7 +7809,7 @@
         <w:pStyle w:val="ListNumber"/>
       </w:pPr>
       <w:r>
-        <w:t>On your computer, create a small text file `hello.txt` containing one line, e.g. `Hello from Azure Blob Storage - AZ-900 Lab 9` (any small text or image file works).</w:t>
+        <w:t>On your computer, create a small text file hello.txt containing one line, e.g. Hello from Azure Blob Storage - AZ-900 Lab 9 (any small text or image file works).</w:t>
       </w:r>
     </w:p>
     <w:p>
@@ -7767,7 +7817,7 @@
         <w:pStyle w:val="ListNumber"/>
       </w:pPr>
       <w:r>
-        <w:t>Open the `labfiles` container → click **Upload**.</w:t>
+        <w:t>Open the labfiles container → click Upload.</w:t>
       </w:r>
     </w:p>
     <w:p>
@@ -7775,7 +7825,7 @@
         <w:pStyle w:val="ListNumber"/>
       </w:pPr>
       <w:r>
-        <w:t>Browse to your file, expand **Advanced** and note the defaults (Block blob, access tier **Hot**), then click **Upload**.</w:t>
+        <w:t>Browse to your file, expand Advanced and note the defaults (Block blob, access tier Hot), then click Upload.</w:t>
       </w:r>
     </w:p>
     <w:p>
@@ -7799,7 +7849,7 @@
         <w:pStyle w:val="ListNumber"/>
       </w:pPr>
       <w:r>
-        <w:t>In the `labfiles` container, click the blob `hello.txt` to open its properties.</w:t>
+        <w:t>In the labfiles container, click the blob hello.txt to open its properties.</w:t>
       </w:r>
     </w:p>
     <w:p>
@@ -7807,7 +7857,7 @@
         <w:pStyle w:val="ListNumber"/>
       </w:pPr>
       <w:r>
-        <w:t>Click **Change tier** (top toolbar), set **Access tier** = `Cool`, click **Save**.</w:t>
+        <w:t>Click Change tier (top toolbar), set Access tier = Cool, click Save.</w:t>
       </w:r>
     </w:p>
     <w:p>
@@ -7815,7 +7865,7 @@
         <w:pStyle w:val="ListNumber"/>
       </w:pPr>
       <w:r>
-        <w:t>Re-open the blob's properties and confirm **Access tier: Cool** and note the tier-change timestamp.</w:t>
+        <w:t>Re-open the blob's properties and confirm Access tier: Cool and note the tier-change timestamp.</w:t>
       </w:r>
     </w:p>
     <w:p>
@@ -7839,7 +7889,7 @@
         <w:pStyle w:val="ListNumber"/>
       </w:pPr>
       <w:r>
-        <w:t>On the blob's **Overview**, copy the **URL** (e.g. `https://staz900tan4821.blob.core.windows.net/labfiles/hello.txt`).</w:t>
+        <w:t>On the blob's Overview, copy the URL (e.g. https://staz900tan4821.blob.core.windows.net/labfiles/hello.txt).</w:t>
       </w:r>
     </w:p>
     <w:p>
@@ -7847,7 +7897,7 @@
         <w:pStyle w:val="ListNumber"/>
       </w:pPr>
       <w:r>
-        <w:t>Paste it into a **private/incognito** browser window.</w:t>
+        <w:t>Paste it into a private/incognito browser window.</w:t>
       </w:r>
     </w:p>
     <w:p>
@@ -7855,7 +7905,7 @@
         <w:pStyle w:val="ListNumber"/>
       </w:pPr>
       <w:r>
-        <w:t>You get an XML error: `ResourceNotFound` / `The specified resource does not exist` - anonymous access is blocked because the container is private.</w:t>
+        <w:t>You get an XML error: ResourceNotFound / The specified resource does not exist - anonymous access is blocked because the container is private.</w:t>
       </w:r>
     </w:p>
     <w:p>
@@ -7879,7 +7929,7 @@
         <w:pStyle w:val="ListNumber"/>
       </w:pPr>
       <w:r>
-        <w:t>Back on the blob's page, click the **Generate SAS** tab.</w:t>
+        <w:t>Back on the blob's page, click the Generate SAS tab.</w:t>
       </w:r>
     </w:p>
     <w:p>
@@ -7895,7 +7945,7 @@
         <w:pStyle w:val="ListBullet"/>
       </w:pPr>
       <w:r>
-        <w:t>Signing method: `Account key`</w:t>
+        <w:t>Signing method: Account key</w:t>
       </w:r>
     </w:p>
     <w:p>
@@ -7903,7 +7953,7 @@
         <w:pStyle w:val="ListBullet"/>
       </w:pPr>
       <w:r>
-        <w:t>Permissions: `Read` only</w:t>
+        <w:t>Permissions: Read only</w:t>
       </w:r>
     </w:p>
     <w:p>
@@ -7919,7 +7969,7 @@
         <w:pStyle w:val="ListNumber"/>
       </w:pPr>
       <w:r>
-        <w:t>Click **Generate SAS token and URL** and copy the **Blob SAS URL**.</w:t>
+        <w:t>Click Generate SAS token and URL and copy the Blob SAS URL.</w:t>
       </w:r>
     </w:p>
     <w:p>
@@ -8098,7 +8148,7 @@
         <w:pStyle w:val="ListNumber"/>
       </w:pPr>
       <w:r>
-        <w:t>On the storage account's left menu, click **Storage browser**.</w:t>
+        <w:t>On the storage account's left menu, click Storage browser.</w:t>
       </w:r>
     </w:p>
     <w:p>
@@ -8106,7 +8156,7 @@
         <w:pStyle w:val="ListNumber"/>
       </w:pPr>
       <w:r>
-        <w:t>Expand **Blob containers → labfiles** and view your blob; note you can also browse **File shares**, **Queues**, and **Tables** from here.</w:t>
+        <w:t>Expand Blob containers → labfiles and view your blob; note you can also browse File shares, Queues, and Tables from here.</w:t>
       </w:r>
     </w:p>
     <w:p>
@@ -8130,7 +8180,7 @@
         <w:pStyle w:val="ListNumber"/>
       </w:pPr>
       <w:r>
-        <w:t>On the storage account's left menu, click **Data management → Redundancy**.</w:t>
+        <w:t>On the storage account's left menu, click Data management → Redundancy.</w:t>
       </w:r>
     </w:p>
     <w:p>
@@ -8282,7 +8332,7 @@
         <w:pStyle w:val="ListBullet"/>
       </w:pPr>
       <w:r>
-        <w:t>A **storage account** is a globally-unique namespace hosting Blobs, Files, Queues, and Tables.</w:t>
+        <w:t>A storage account is a globally-unique namespace hosting Blobs, Files, Queues, and Tables.</w:t>
       </w:r>
     </w:p>
     <w:p>
@@ -8290,7 +8340,7 @@
         <w:pStyle w:val="ListBullet"/>
       </w:pPr>
       <w:r>
-        <w:t>**Access tiers** (Hot/Cool/Cold/Archive) trade storage cost against access cost for infrequently used data.</w:t>
+        <w:t>Access tiers (Hot/Cool/Cold/Archive) trade storage cost against access cost for infrequently used data.</w:t>
       </w:r>
     </w:p>
     <w:p>
@@ -8298,7 +8348,7 @@
         <w:pStyle w:val="ListBullet"/>
       </w:pPr>
       <w:r>
-        <w:t>Private containers block anonymous access; a **SAS token** grants scoped, time-limited access without exposing account keys.</w:t>
+        <w:t>Private containers block anonymous access; a SAS token grants scoped, time-limited access without exposing account keys.</w:t>
       </w:r>
     </w:p>
     <w:p>
@@ -8306,7 +8356,7 @@
         <w:pStyle w:val="ListBullet"/>
       </w:pPr>
       <w:r>
-        <w:t>Data-plane access uses either **Entra ID roles** (e.g. Storage Blob Data Reader) or **account keys** - separate from management-plane RBAC.</w:t>
+        <w:t>Data-plane access uses either Entra ID roles (e.g. Storage Blob Data Reader) or account keys - separate from management-plane RBAC.</w:t>
       </w:r>
     </w:p>
     <w:p>
@@ -8314,7 +8364,7 @@
         <w:pStyle w:val="ListBullet"/>
       </w:pPr>
       <w:r>
-        <w:t>**Redundancy options** (LRS → ZRS → GRS → GZRS) increase durability and cost by copying data across zones and paired regions.</w:t>
+        <w:t>Redundancy options (LRS → ZRS → GRS → GZRS) increase durability and cost by copying data across zones and paired regions.</w:t>
       </w:r>
     </w:p>
     <w:p>
@@ -8390,7 +8440,7 @@
         <w:pStyle w:val="ListNumber"/>
       </w:pPr>
       <w:r>
-        <w:t>Click **Create a resource** → search **SQL Database** → **Create** → **SQL Database**.</w:t>
+        <w:t>Click Create a resource → search SQL Database → Create → SQL Database.</w:t>
       </w:r>
     </w:p>
     <w:p>
@@ -8398,7 +8448,7 @@
         <w:pStyle w:val="ListNumber"/>
       </w:pPr>
       <w:r>
-        <w:t>On the **Basics** tab set:</w:t>
+        <w:t>On the Basics tab set:</w:t>
       </w:r>
     </w:p>
     <w:p>
@@ -8414,7 +8464,7 @@
         <w:pStyle w:val="ListBullet"/>
       </w:pPr>
       <w:r>
-        <w:t>Resource group: `rg-az900-labs` (create it if it doesn't exist)</w:t>
+        <w:t>Resource group: rg-az900-labs (create it if it doesn't exist)</w:t>
       </w:r>
     </w:p>
     <w:p>
@@ -8422,7 +8472,7 @@
         <w:pStyle w:val="ListBullet"/>
       </w:pPr>
       <w:r>
-        <w:t>Database name: `db-az900`</w:t>
+        <w:t>Database name: db-az900</w:t>
       </w:r>
     </w:p>
     <w:p>
@@ -8438,7 +8488,7 @@
         <w:pStyle w:val="ListNumber"/>
       </w:pPr>
       <w:r>
-        <w:t>Under **Server**, click **Create new** and enter:</w:t>
+        <w:t>Under Server, click Create new and enter:</w:t>
       </w:r>
     </w:p>
     <w:p>
@@ -8572,7 +8622,7 @@
         <w:pStyle w:val="ListNumber"/>
       </w:pPr>
       <w:r>
-        <w:t>Click **OK**.</w:t>
+        <w:t>Click OK.</w:t>
       </w:r>
     </w:p>
     <w:p>
@@ -8596,7 +8646,7 @@
         <w:pStyle w:val="ListNumber"/>
       </w:pPr>
       <w:r>
-        <w:t>Back on **Basics**, set **Workload environment** = `Development` if offered.</w:t>
+        <w:t>Back on Basics, set Workload environment = Development if offered.</w:t>
       </w:r>
     </w:p>
     <w:p>
@@ -8604,7 +8654,7 @@
         <w:pStyle w:val="ListNumber"/>
       </w:pPr>
       <w:r>
-        <w:t>Under **Compute + storage**, click **Configure database**.</w:t>
+        <w:t>Under Compute + storage, click Configure database.</w:t>
       </w:r>
     </w:p>
     <w:p>
@@ -8620,7 +8670,7 @@
         <w:pStyle w:val="ListBullet"/>
       </w:pPr>
       <w:r>
-        <w:t>**Service tier** = `Basic` (5 DTUs, 2 GB) - simplest and about USD 5/month, or</w:t>
+        <w:t>Service tier = Basic (5 DTUs, 2 GB) - simplest and about USD 5/month, or</w:t>
       </w:r>
     </w:p>
     <w:p>
@@ -8628,7 +8678,7 @@
         <w:pStyle w:val="ListBullet"/>
       </w:pPr>
       <w:r>
-        <w:t>**Service tier** = `General Purpose (Serverless)` with **Auto-pause delay** = 1 hour and min/max vCores at the lowest values - bills per second of use and pauses when idle.</w:t>
+        <w:t>Service tier = General Purpose (Serverless) with Auto-pause delay = 1 hour and min/max vCores at the lowest values - bills per second of use and pauses when idle.</w:t>
       </w:r>
     </w:p>
     <w:p>
@@ -8636,7 +8686,7 @@
         <w:pStyle w:val="ListNumber"/>
       </w:pPr>
       <w:r>
-        <w:t>Click **Apply**. On **Basics**, set **Backup storage redundancy** = `Locally-redundant backup storage`.</w:t>
+        <w:t>Click Apply. On Basics, set Backup storage redundancy = Locally-redundant backup storage.</w:t>
       </w:r>
     </w:p>
     <w:p>
@@ -8660,7 +8710,7 @@
         <w:pStyle w:val="ListNumber"/>
       </w:pPr>
       <w:r>
-        <w:t>Click **Next: Networking** and set:</w:t>
+        <w:t>Click Next: Networking and set:</w:t>
       </w:r>
     </w:p>
     <w:p>
@@ -8668,7 +8718,7 @@
         <w:pStyle w:val="ListBullet"/>
       </w:pPr>
       <w:r>
-        <w:t>Connectivity method: `Public endpoint`</w:t>
+        <w:t>Connectivity method: Public endpoint</w:t>
       </w:r>
     </w:p>
     <w:p>
@@ -8676,7 +8726,7 @@
         <w:pStyle w:val="ListBullet"/>
       </w:pPr>
       <w:r>
-        <w:t>Allow Azure services and resources to access this server: `Yes`</w:t>
+        <w:t>Allow Azure services and resources to access this server: Yes</w:t>
       </w:r>
     </w:p>
     <w:p>
@@ -8684,7 +8734,7 @@
         <w:pStyle w:val="ListBullet"/>
       </w:pPr>
       <w:r>
-        <w:t>Add current client IP address: `Yes`</w:t>
+        <w:t>Add current client IP address: Yes</w:t>
       </w:r>
     </w:p>
     <w:p>
@@ -8692,7 +8742,7 @@
         <w:pStyle w:val="ListNumber"/>
       </w:pPr>
       <w:r>
-        <w:t>Leave **Connection policy** at Default.</w:t>
+        <w:t>Leave Connection policy at Default.</w:t>
       </w:r>
     </w:p>
     <w:p>
@@ -8716,7 +8766,7 @@
         <w:pStyle w:val="ListNumber"/>
       </w:pPr>
       <w:r>
-        <w:t>Click **Next: Security** - leave defaults (make sure **Microsoft Defender for SQL** = `Not now` to avoid charges).</w:t>
+        <w:t>Click Next: Security - leave defaults (make sure Microsoft Defender for SQL = Not now to avoid charges).</w:t>
       </w:r>
     </w:p>
     <w:p>
@@ -8724,7 +8774,7 @@
         <w:pStyle w:val="ListNumber"/>
       </w:pPr>
       <w:r>
-        <w:t>Click **Next: Additional settings** and set:</w:t>
+        <w:t>Click Next: Additional settings and set:</w:t>
       </w:r>
     </w:p>
     <w:p>
@@ -8732,7 +8782,7 @@
         <w:pStyle w:val="ListBullet"/>
       </w:pPr>
       <w:r>
-        <w:t>Use existing data: `Sample` (this loads the **AdventureWorksLT** database; accept the collation prompt)</w:t>
+        <w:t>Use existing data: Sample (this loads the AdventureWorksLT database; accept the collation prompt)</w:t>
       </w:r>
     </w:p>
     <w:p>
@@ -8740,7 +8790,7 @@
         <w:pStyle w:val="ListNumber"/>
       </w:pPr>
       <w:r>
-        <w:t>Click **Review + create** → **Create**. Deployment takes 2-5 minutes; then click **Go to resource**.</w:t>
+        <w:t>Click Review + create → Create. Deployment takes 2-5 minutes; then click Go to resource.</w:t>
       </w:r>
     </w:p>
     <w:p>
@@ -8756,7 +8806,7 @@
         <w:pStyle w:val="ListNumber"/>
       </w:pPr>
       <w:r>
-        <w:t>On the **db-az900** database blade, click **Query editor (preview)** in the left menu.</w:t>
+        <w:t>On the db-az900 database blade, click Query editor (preview) in the left menu.</w:t>
       </w:r>
     </w:p>
     <w:p>
@@ -8764,7 +8814,7 @@
         <w:pStyle w:val="ListNumber"/>
       </w:pPr>
       <w:r>
-        <w:t>Sign in with **SQL server authentication**: login `sqladmin` and your password from Step 2.</w:t>
+        <w:t>Sign in with SQL server authentication: login sqladmin and your password from Step 2.</w:t>
       </w:r>
     </w:p>
     <w:p>
@@ -8792,7 +8842,7 @@
         <w:pStyle w:val="ListNumber"/>
       </w:pPr>
       <w:r>
-        <w:t>Click **Run** - the 10 most expensive AdventureWorks products appear in the Results grid.</w:t>
+        <w:t>Click Run - the 10 most expensive AdventureWorks products appear in the Results grid.</w:t>
       </w:r>
     </w:p>
     <w:p>
@@ -8816,7 +8866,7 @@
         <w:pStyle w:val="ListNumber"/>
       </w:pPr>
       <w:r>
-        <w:t>On the database's **Overview** blade note: compute tier, storage used, and the server name `sql-az900-....database.windows.net`.</w:t>
+        <w:t>On the database's Overview blade note: compute tier, storage used, and the server name sql-az900-....database.windows.net.</w:t>
       </w:r>
     </w:p>
     <w:p>
@@ -8824,7 +8874,7 @@
         <w:pStyle w:val="ListNumber"/>
       </w:pPr>
       <w:r>
-        <w:t>Look at the left menu: there is no "Restart VM", no OS, no patching schedule. Under **Data management → Backups** (on the server) note that automated backups with point-in-time restore are already running - you configured nothing.</w:t>
+        <w:t>Look at the left menu: there is no "Restart VM", no OS, no patching schedule. Under Data management → Backups (on the server) note that automated backups with point-in-time restore are already running - you configured nothing.</w:t>
       </w:r>
     </w:p>
     <w:p>
@@ -8848,7 +8898,7 @@
         <w:pStyle w:val="ListNumber"/>
       </w:pPr>
       <w:r>
-        <w:t>From the database **Overview**, click the **Server name** link to open the logical server.</w:t>
+        <w:t>From the database Overview, click the Server name link to open the logical server.</w:t>
       </w:r>
     </w:p>
     <w:p>
@@ -8856,7 +8906,7 @@
         <w:pStyle w:val="ListNumber"/>
       </w:pPr>
       <w:r>
-        <w:t>In the left menu click **Security → Networking**.</w:t>
+        <w:t>In the left menu click Security → Networking.</w:t>
       </w:r>
     </w:p>
     <w:p>
@@ -8864,7 +8914,7 @@
         <w:pStyle w:val="ListNumber"/>
       </w:pPr>
       <w:r>
-        <w:t>Under **Firewall rules**, see the rule with your client IP (added in Step 4) and the checkbox **Allow Azure services and resources to access this server**.</w:t>
+        <w:t>Under Firewall rules, see the rule with your client IP (added in Step 4) and the checkbox Allow Azure services and resources to access this server.</w:t>
       </w:r>
     </w:p>
     <w:p>
@@ -8988,7 +9038,7 @@
         <w:pStyle w:val="ListBullet"/>
       </w:pPr>
       <w:r>
-        <w:t>**Azure SQL Database** is a PaaS relational database: Microsoft manages the OS, patching, high availability, and automated backups.</w:t>
+        <w:t>Azure SQL Database is a PaaS relational database: Microsoft manages the OS, patching, high availability, and automated backups.</w:t>
       </w:r>
     </w:p>
     <w:p>
@@ -8996,7 +9046,7 @@
         <w:pStyle w:val="ListBullet"/>
       </w:pPr>
       <w:r>
-        <w:t>A **logical SQL server** is an administrative boundary for logins and firewall rules, not a machine.</w:t>
+        <w:t>A logical SQL server is an administrative boundary for logins and firewall rules, not a machine.</w:t>
       </w:r>
     </w:p>
     <w:p>
@@ -9004,7 +9054,7 @@
         <w:pStyle w:val="ListBullet"/>
       </w:pPr>
       <w:r>
-        <w:t>**DTU (Basic)** vs **vCore serverless with auto-pause** are two purchasing models - serverless embodies pay-per-use consumption pricing.</w:t>
+        <w:t>DTU (Basic) vs vCore serverless with auto-pause are two purchasing models - serverless embodies pay-per-use consumption pricing.</w:t>
       </w:r>
     </w:p>
     <w:p>
@@ -9012,7 +9062,7 @@
         <w:pStyle w:val="ListBullet"/>
       </w:pPr>
       <w:r>
-        <w:t>The **server firewall** blocks all access by default; you explicitly allow client IPs and Azure services.</w:t>
+        <w:t>The server firewall blocks all access by default; you explicitly allow client IPs and Azure services.</w:t>
       </w:r>
     </w:p>
     <w:p>
@@ -9020,7 +9070,7 @@
         <w:pStyle w:val="ListBullet"/>
       </w:pPr>
       <w:r>
-        <w:t>**Query editor** in the portal lets you run T-SQL with zero client tooling - useful for quick verification and demos.</w:t>
+        <w:t>Query editor in the portal lets you run T-SQL with zero client tooling - useful for quick verification and demos.</w:t>
       </w:r>
     </w:p>
     <w:p>
@@ -9111,7 +9161,7 @@
         <w:pStyle w:val="ListNumber"/>
       </w:pPr>
       <w:r>
-        <w:t>Click your account avatar (top-right) → **Switch directory**.</w:t>
+        <w:t>Click your account avatar (top-right) → Switch directory.</w:t>
       </w:r>
     </w:p>
     <w:p>
@@ -9119,7 +9169,7 @@
         <w:pStyle w:val="ListNumber"/>
       </w:pPr>
       <w:r>
-        <w:t>Confirm the current directory is your personal free-account tenant (usually named "Default Directory" with a domain like `&lt;yourname&gt;outlook.onmicrosoft.com`). Switch to it if not.</w:t>
+        <w:t>Confirm the current directory is your personal free-account tenant (usually named "Default Directory" with a domain like &lt;yourname&gt;outlook.onmicrosoft.com). Switch to it if not.</w:t>
       </w:r>
     </w:p>
     <w:p>
@@ -9135,7 +9185,7 @@
         <w:pStyle w:val="ListNumber"/>
       </w:pPr>
       <w:r>
-        <w:t>In the portal search bar, type **Microsoft Entra ID** and open it.</w:t>
+        <w:t>In the portal search bar, type Microsoft Entra ID and open it.</w:t>
       </w:r>
     </w:p>
     <w:p>
@@ -9143,7 +9193,7 @@
         <w:pStyle w:val="ListNumber"/>
       </w:pPr>
       <w:r>
-        <w:t>On the **Overview** blade, write down:</w:t>
+        <w:t>On the Overview blade, write down:</w:t>
       </w:r>
     </w:p>
     <w:p>
@@ -9151,7 +9201,7 @@
         <w:pStyle w:val="ListBullet"/>
       </w:pPr>
       <w:r>
-        <w:t>**Tenant name** (e.g. `Default Directory`)</w:t>
+        <w:t>Tenant name (e.g. Default Directory)</w:t>
       </w:r>
     </w:p>
     <w:p>
@@ -9159,7 +9209,7 @@
         <w:pStyle w:val="ListBullet"/>
       </w:pPr>
       <w:r>
-        <w:t>**Primary domain** - `&lt;something&gt;.onmicrosoft.com` (you need this exact value in Step 3)</w:t>
+        <w:t>Primary domain - &lt;something&gt;.onmicrosoft.com (you need this exact value in Step 3)</w:t>
       </w:r>
     </w:p>
     <w:p>
@@ -9167,7 +9217,7 @@
         <w:pStyle w:val="ListBullet"/>
       </w:pPr>
       <w:r>
-        <w:t>**Tenant ID** - a GUID</w:t>
+        <w:t>Tenant ID - a GUID</w:t>
       </w:r>
     </w:p>
     <w:p>
@@ -9199,7 +9249,7 @@
         <w:pStyle w:val="ListNumber"/>
       </w:pPr>
       <w:r>
-        <w:t>In Entra ID, click **Manage → Users** → **+ New user** → **Create new user**.</w:t>
+        <w:t>In Entra ID, click Manage → Users → + New user → Create new user.</w:t>
       </w:r>
     </w:p>
     <w:p>
@@ -9207,7 +9257,7 @@
         <w:pStyle w:val="ListNumber"/>
       </w:pPr>
       <w:r>
-        <w:t>On the **Basics** tab enter:</w:t>
+        <w:t>On the Basics tab enter:</w:t>
       </w:r>
     </w:p>
     <w:p>
@@ -9323,7 +9373,7 @@
         <w:pStyle w:val="ListNumber"/>
       </w:pPr>
       <w:r>
-        <w:t>Click **Review + create** → **Create**.</w:t>
+        <w:t>Click Review + create → Create.</w:t>
       </w:r>
     </w:p>
     <w:p>
@@ -9331,7 +9381,7 @@
         <w:pStyle w:val="ListNumber"/>
       </w:pPr>
       <w:r>
-        <w:t>Refresh the Users list and confirm `AZ900 Learner` appears with source "Cloud".</w:t>
+        <w:t>Refresh the Users list and confirm AZ900 Learner appears with source "Cloud".</w:t>
       </w:r>
     </w:p>
     <w:p>
@@ -9355,7 +9405,7 @@
         <w:pStyle w:val="ListNumber"/>
       </w:pPr>
       <w:r>
-        <w:t>In Entra ID, click **Manage → Groups** → **+ New group**.</w:t>
+        <w:t>In Entra ID, click Manage → Groups → + New group.</w:t>
       </w:r>
     </w:p>
     <w:p>
@@ -9371,7 +9421,7 @@
         <w:pStyle w:val="ListBullet"/>
       </w:pPr>
       <w:r>
-        <w:t>Group type: `Security`</w:t>
+        <w:t>Group type: Security</w:t>
       </w:r>
     </w:p>
     <w:p>
@@ -9379,7 +9429,7 @@
         <w:pStyle w:val="ListBullet"/>
       </w:pPr>
       <w:r>
-        <w:t>Group name: `grp-az900-learners`</w:t>
+        <w:t>Group name: grp-az900-learners</w:t>
       </w:r>
     </w:p>
     <w:p>
@@ -9387,7 +9437,7 @@
         <w:pStyle w:val="ListBullet"/>
       </w:pPr>
       <w:r>
-        <w:t>Membership type: `Assigned`</w:t>
+        <w:t>Membership type: Assigned</w:t>
       </w:r>
     </w:p>
     <w:p>
@@ -9395,7 +9445,7 @@
         <w:pStyle w:val="ListNumber"/>
       </w:pPr>
       <w:r>
-        <w:t>Click **Create**.</w:t>
+        <w:t>Click Create.</w:t>
       </w:r>
     </w:p>
     <w:p>
@@ -9432,7 +9482,7 @@
         <w:pStyle w:val="ListNumber"/>
       </w:pPr>
       <w:r>
-        <w:t>Open **grp-az900-learners** → **Manage → Members** → **+ Add members**.</w:t>
+        <w:t>Open grp-az900-learners → Manage → Members → + Add members.</w:t>
       </w:r>
     </w:p>
     <w:p>
@@ -9440,7 +9490,7 @@
         <w:pStyle w:val="ListNumber"/>
       </w:pPr>
       <w:r>
-        <w:t>Search for `AZ900 Learner`, select it, click **Select**.</w:t>
+        <w:t>Search for AZ900 Learner, select it, click Select.</w:t>
       </w:r>
     </w:p>
     <w:p>
@@ -9485,7 +9535,7 @@
         <w:pStyle w:val="ListNumber"/>
       </w:pPr>
       <w:r>
-        <w:t>Open a **private/incognito** browser window and go to https://portal.azure.com.</w:t>
+        <w:t>Open a private/incognito browser window and go to https://portal.azure.com.</w:t>
       </w:r>
     </w:p>
     <w:p>
@@ -9493,7 +9543,7 @@
         <w:pStyle w:val="ListNumber"/>
       </w:pPr>
       <w:r>
-        <w:t>Sign in as `az900.learner@&lt;yourtenant&gt;.onmicrosoft.com` with the auto-generated password.</w:t>
+        <w:t>Sign in as az900.learner@&lt;yourtenant&gt;.onmicrosoft.com with the auto-generated password.</w:t>
       </w:r>
     </w:p>
     <w:p>
@@ -9501,7 +9551,7 @@
         <w:pStyle w:val="ListNumber"/>
       </w:pPr>
       <w:r>
-        <w:t>You are forced to **update the password** - set a new one and note it (keep MFA enrolment prompts minimal if offered; you can select "Ask later" where available).</w:t>
+        <w:t>You are forced to update the password - set a new one and note it (keep MFA enrolment prompts minimal if offered; you can select "Ask later" where available).</w:t>
       </w:r>
     </w:p>
     <w:p>
@@ -9509,7 +9559,7 @@
         <w:pStyle w:val="ListNumber"/>
       </w:pPr>
       <w:r>
-        <w:t>The portal opens. **Authentication succeeded** - the tenant verified who this user is.</w:t>
+        <w:t>The portal opens. Authentication succeeded - the tenant verified who this user is.</w:t>
       </w:r>
     </w:p>
     <w:p>
@@ -9547,7 +9597,7 @@
         <w:pStyle w:val="ListNumber"/>
       </w:pPr>
       <w:r>
-        <w:t>Search **Subscriptions** - the list is empty ("You don't have any subscriptions").</w:t>
+        <w:t>Search Subscriptions - the list is empty ("You don't have any subscriptions").</w:t>
       </w:r>
     </w:p>
     <w:p>
@@ -9555,7 +9605,7 @@
         <w:pStyle w:val="ListNumber"/>
       </w:pPr>
       <w:r>
-        <w:t>Search **Resource groups** - no resource groups are visible, even though `rg-az900-labs` exists in the same tenant.</w:t>
+        <w:t>Search Resource groups - no resource groups are visible, even though rg-az900-labs exists in the same tenant.</w:t>
       </w:r>
     </w:p>
     <w:p>
@@ -9563,7 +9613,7 @@
         <w:pStyle w:val="ListNumber"/>
       </w:pPr>
       <w:r>
-        <w:t>Try **Create a resource** → pick anything → the Basics tab has no subscription to select, so creation is impossible.</w:t>
+        <w:t>Try Create a resource → pick anything → the Basics tab has no subscription to select, so creation is impossible.</w:t>
       </w:r>
     </w:p>
     <w:p>
@@ -9634,7 +9684,7 @@
         <w:pStyle w:val="ListNumber"/>
       </w:pPr>
       <w:r>
-        <w:t>In Entra ID, click **Manage → Security → Authentication methods** (or **Manage → Users** → select a user → **Authentication methods**).</w:t>
+        <w:t>In Entra ID, click Manage → Security → Authentication methods (or Manage → Users → select a user → Authentication methods).</w:t>
       </w:r>
     </w:p>
     <w:p>
@@ -9650,7 +9700,7 @@
         <w:pStyle w:val="ListNumber"/>
       </w:pPr>
       <w:r>
-        <w:t>**Do NOT enable any enforcement policy** - just note that multifactor authentication requires two or more of: something you know (password), something you have (phone/key), something you are (biometric).</w:t>
+        <w:t>Do NOT enable any enforcement policy - just note that multifactor authentication requires two or more of: something you know (password), something you have (phone/key), something you are (biometric).</w:t>
       </w:r>
     </w:p>
     <w:p>
@@ -9688,7 +9738,7 @@
           <w:b/>
           <w:sz w:val="21"/>
         </w:rPr>
-        <w:t>Keep the user `az900.learner` and the group `grp-az900-learners` - Lab 12 (RBAC) reuses them.</w:t>
+        <w:t>Keep the user az900.learner and the group grp-az900-learners - Lab 12 (RBAC) reuses them.</w:t>
       </w:r>
       <w:r>
         <w:rPr>
@@ -9812,7 +9862,7 @@
         <w:pStyle w:val="ListBullet"/>
       </w:pPr>
       <w:r>
-        <w:t>**Microsoft Entra ID** is Azure's cloud identity service; every subscription trusts one tenant, identified by a primary domain and tenant ID.</w:t>
+        <w:t>Microsoft Entra ID is Azure's cloud identity service; every subscription trusts one tenant, identified by a primary domain and tenant ID.</w:t>
       </w:r>
     </w:p>
     <w:p>
@@ -9820,7 +9870,7 @@
         <w:pStyle w:val="ListBullet"/>
       </w:pPr>
       <w:r>
-        <w:t>**Users** are identities; **security groups** (Assigned or Dynamic) are the unit you should manage access with.</w:t>
+        <w:t>Users are identities; security groups (Assigned or Dynamic) are the unit you should manage access with.</w:t>
       </w:r>
     </w:p>
     <w:p>
@@ -9828,7 +9878,7 @@
         <w:pStyle w:val="ListBullet"/>
       </w:pPr>
       <w:r>
-        <w:t>**Authentication** (proving who you are) is separate from **authorization** (what you may do) - a new user can sign in yet see zero subscriptions or resources.</w:t>
+        <w:t>Authentication (proving who you are) is separate from authorization (what you may do) - a new user can sign in yet see zero subscriptions or resources.</w:t>
       </w:r>
     </w:p>
     <w:p>
@@ -9836,7 +9886,7 @@
         <w:pStyle w:val="ListBullet"/>
       </w:pPr>
       <w:r>
-        <w:t>Azure resource access comes from **RBAC role assignments**, not from merely existing in the tenant (explored in Lab 12).</w:t>
+        <w:t>Azure resource access comes from RBAC role assignments, not from merely existing in the tenant (explored in Lab 12).</w:t>
       </w:r>
     </w:p>
     <w:p>
@@ -9844,7 +9894,7 @@
         <w:pStyle w:val="ListBullet"/>
       </w:pPr>
       <w:r>
-        <w:t>**MFA** strengthens authentication by combining something you know, have, and are; Entra ID supports Authenticator, SMS, and FIDO2 keys.</w:t>
+        <w:t>MFA strengthens authentication by combining something you know, have, and are; Entra ID supports Authenticator, SMS, and FIDO2 keys.</w:t>
       </w:r>
     </w:p>
     <w:p>
@@ -9948,7 +9998,7 @@
         <w:pStyle w:val="ListNumber"/>
       </w:pPr>
       <w:r>
-        <w:t>In the portal search bar, type **Resource groups** and open it.</w:t>
+        <w:t>In the portal search bar, type Resource groups and open it.</w:t>
       </w:r>
     </w:p>
     <w:p>
@@ -9956,7 +10006,7 @@
         <w:pStyle w:val="ListNumber"/>
       </w:pPr>
       <w:r>
-        <w:t>Click **rg-az900-labs** (if it does not exist, click **+ Create**, name it `rg-az900-labs`, region **Southeast Asia**, then open it).</w:t>
+        <w:t>Click rg-az900-labs (if it does not exist, click + Create, name it rg-az900-labs, region Southeast Asia, then open it).</w:t>
       </w:r>
     </w:p>
     <w:p>
@@ -9964,7 +10014,7 @@
         <w:pStyle w:val="ListNumber"/>
       </w:pPr>
       <w:r>
-        <w:t>In the left menu, click **Access control (IAM)**.</w:t>
+        <w:t>In the left menu, click Access control (IAM).</w:t>
       </w:r>
     </w:p>
     <w:p>
@@ -9988,7 +10038,7 @@
         <w:pStyle w:val="ListNumber"/>
       </w:pPr>
       <w:r>
-        <w:t>On the **Access control (IAM)** blade, click the **Role assignments** tab.</w:t>
+        <w:t>On the Access control (IAM) blade, click the Role assignments tab.</w:t>
       </w:r>
     </w:p>
     <w:p>
@@ -9996,7 +10046,7 @@
         <w:pStyle w:val="ListNumber"/>
       </w:pPr>
       <w:r>
-        <w:t>Find your own account in the list. Note the **Role** column shows **Owner** and the **Scope** column shows **Subscription (Inherited)**.</w:t>
+        <w:t>Find your own account in the list. Note the Role column shows Owner and the Scope column shows Subscription (Inherited).</w:t>
       </w:r>
     </w:p>
     <w:p>
@@ -10020,7 +10070,7 @@
         <w:pStyle w:val="ListNumber"/>
       </w:pPr>
       <w:r>
-        <w:t>Click the **Roles** tab.</w:t>
+        <w:t>Click the Roles tab.</w:t>
       </w:r>
     </w:p>
     <w:p>
@@ -10028,7 +10078,7 @@
         <w:pStyle w:val="ListNumber"/>
       </w:pPr>
       <w:r>
-        <w:t>In the search box type **Reader**, then click **View** (under the **Details** column) on the **Reader** row.</w:t>
+        <w:t>In the search box type Reader, then click View (under the Details column) on the Reader row.</w:t>
       </w:r>
     </w:p>
     <w:p>
@@ -10036,7 +10086,7 @@
         <w:pStyle w:val="ListNumber"/>
       </w:pPr>
       <w:r>
-        <w:t>On the **Permissions** tab note the single action: `*/read`.</w:t>
+        <w:t>On the Permissions tab note the single action: */read.</w:t>
       </w:r>
     </w:p>
     <w:p>
@@ -10044,7 +10094,7 @@
         <w:pStyle w:val="ListNumber"/>
       </w:pPr>
       <w:r>
-        <w:t>Click the **JSON** tab to see the raw role definition. Close the pane.</w:t>
+        <w:t>Click the JSON tab to see the raw role definition. Close the pane.</w:t>
       </w:r>
     </w:p>
     <w:p>
@@ -10052,7 +10102,7 @@
         <w:pStyle w:val="ListNumber"/>
       </w:pPr>
       <w:r>
-        <w:t>Repeat for **Contributor** - actions `*` but with **NotActions** blocking `Microsoft.Authorization/*/Write` (cannot grant access to others).</w:t>
+        <w:t>Repeat for Contributor - actions * but with NotActions blocking Microsoft.Authorization/*/Write (cannot grant access to others).</w:t>
       </w:r>
     </w:p>
     <w:p>
@@ -10060,7 +10110,7 @@
         <w:pStyle w:val="ListNumber"/>
       </w:pPr>
       <w:r>
-        <w:t>Repeat for **Owner** - actions `*` with no RBAC restrictions.</w:t>
+        <w:t>Repeat for Owner - actions * with no RBAC restrictions.</w:t>
       </w:r>
     </w:p>
     <w:p>
@@ -10116,7 +10166,7 @@
         <w:pStyle w:val="ListNumber"/>
       </w:pPr>
       <w:r>
-        <w:t>Back on **Access control (IAM)**, click **+ Add** &gt; **Add role assignment**.</w:t>
+        <w:t>Back on Access control (IAM), click + Add &gt; Add role assignment.</w:t>
       </w:r>
     </w:p>
     <w:p>
@@ -10124,7 +10174,7 @@
         <w:pStyle w:val="ListNumber"/>
       </w:pPr>
       <w:r>
-        <w:t>On the **Role** tab, under **Job function roles**, select **Reader** and click **Next**.</w:t>
+        <w:t>On the Role tab, under Job function roles, select Reader and click Next.</w:t>
       </w:r>
     </w:p>
     <w:p>
@@ -10132,7 +10182,7 @@
         <w:pStyle w:val="ListNumber"/>
       </w:pPr>
       <w:r>
-        <w:t>On the **Members** tab:</w:t>
+        <w:t>On the Members tab:</w:t>
       </w:r>
     </w:p>
     <w:p>
@@ -10140,7 +10190,7 @@
         <w:pStyle w:val="ListBullet"/>
       </w:pPr>
       <w:r>
-        <w:t>**Assign access to**: `User, group, or service principal`</w:t>
+        <w:t>Assign access to: User, group, or service principal</w:t>
       </w:r>
     </w:p>
     <w:p>
@@ -10148,7 +10198,7 @@
         <w:pStyle w:val="ListBullet"/>
       </w:pPr>
       <w:r>
-        <w:t>Click **+ Select members**, search for `az900.learner`, select the user, click **Select**.</w:t>
+        <w:t>Click + Select members, search for az900.learner, select the user, click Select.</w:t>
       </w:r>
     </w:p>
     <w:p>
@@ -10156,7 +10206,7 @@
         <w:pStyle w:val="ListNumber"/>
       </w:pPr>
       <w:r>
-        <w:t>Click **Review + assign** twice.</w:t>
+        <w:t>Click Review + assign twice.</w:t>
       </w:r>
     </w:p>
     <w:p>
@@ -10180,7 +10230,7 @@
         <w:pStyle w:val="ListNumber"/>
       </w:pPr>
       <w:r>
-        <w:t>Open a **private/incognito** browser window and go to https://portal.azure.com.</w:t>
+        <w:t>Open a private/incognito browser window and go to https://portal.azure.com.</w:t>
       </w:r>
     </w:p>
     <w:p>
@@ -10188,7 +10238,7 @@
         <w:pStyle w:val="ListNumber"/>
       </w:pPr>
       <w:r>
-        <w:t>Sign in as `az900.learner@&lt;yourtenant&gt;.onmicrosoft.com` (password from Lab 11; change it if prompted).</w:t>
+        <w:t>Sign in as az900.learner@&lt;yourtenant&gt;.onmicrosoft.com (password from Lab 11; change it if prompted).</w:t>
       </w:r>
     </w:p>
     <w:p>
@@ -10196,7 +10246,7 @@
         <w:pStyle w:val="ListNumber"/>
       </w:pPr>
       <w:r>
-        <w:t>Search for **Resource groups** - the user can now see **rg-az900-labs** and open the resources inside it (e.g. the Lab 9 storage account).</w:t>
+        <w:t>Search for Resource groups - the user can now see rg-az900-labs and open the resources inside it (e.g. the Lab 9 storage account).</w:t>
       </w:r>
     </w:p>
     <w:p>
@@ -10246,7 +10296,7 @@
         <w:pStyle w:val="ListNumber"/>
       </w:pPr>
       <w:r>
-        <w:t>Still signed in as `az900.learner`, open **rg-az900-labs** and click **+ Create**.</w:t>
+        <w:t>Still signed in as az900.learner, open rg-az900-labs and click + Create.</w:t>
       </w:r>
     </w:p>
     <w:p>
@@ -10254,7 +10304,7 @@
         <w:pStyle w:val="ListNumber"/>
       </w:pPr>
       <w:r>
-        <w:t>Search for **Storage account**, click **Create**, pick any name and click **Review + create** &gt; **Create**.</w:t>
+        <w:t>Search for Storage account, click Create, pick any name and click Review + create &gt; Create.</w:t>
       </w:r>
     </w:p>
     <w:p>
@@ -10270,7 +10320,7 @@
         <w:pStyle w:val="ListBullet"/>
       </w:pPr>
       <w:r>
-        <w:t>`The client 'az900.learner@...' with object id '...' does not have authorization to perform action 'Microsoft.Storage/storageAccounts/write' over scope '/subscriptions/.../resourceGroups/rg-az900-labs' ...`</w:t>
+        <w:t>The client 'az900.learner@...' with object id '...' does not have authorization to perform action 'Microsoft.Storage/storageAccounts/write' over scope '/subscriptions/.../resourceGroups/rg-az900-labs' ...</w:t>
       </w:r>
     </w:p>
     <w:p>
@@ -10278,7 +10328,7 @@
         <w:pStyle w:val="ListNumber"/>
       </w:pPr>
       <w:r>
-        <w:t>Also note that on any existing resource the **Delete** button is greyed out or fails the same way.</w:t>
+        <w:t>Also note that on any existing resource the Delete button is greyed out or fails the same way.</w:t>
       </w:r>
     </w:p>
     <w:p>
@@ -10310,7 +10360,7 @@
         <w:pStyle w:val="ListNumber"/>
       </w:pPr>
       <w:r>
-        <w:t>Back in your own (Owner) session, open **rg-az900-labs** &gt; **Access control (IAM)** &gt; **Check access** tab.</w:t>
+        <w:t>Back in your own (Owner) session, open rg-az900-labs &gt; Access control (IAM) &gt; Check access tab.</w:t>
       </w:r>
     </w:p>
     <w:p>
@@ -10318,7 +10368,7 @@
         <w:pStyle w:val="ListNumber"/>
       </w:pPr>
       <w:r>
-        <w:t>Click **Check access**, search for `az900.learner`, and select the user.</w:t>
+        <w:t>Click Check access, search for az900.learner, and select the user.</w:t>
       </w:r>
     </w:p>
     <w:p>
@@ -10326,7 +10376,7 @@
         <w:pStyle w:val="ListNumber"/>
       </w:pPr>
       <w:r>
-        <w:t>The pane lists the user's current assignments at this scope: **Reader**.</w:t>
+        <w:t>The pane lists the user's current assignments at this scope: Reader.</w:t>
       </w:r>
     </w:p>
     <w:p>
@@ -10463,7 +10513,7 @@
         <w:pStyle w:val="ListNumber"/>
       </w:pPr>
       <w:r>
-        <w:t>Go to **rg-az900-labs** &gt; **Access control (IAM)** &gt; **Role assignments** tab.</w:t>
+        <w:t>Go to rg-az900-labs &gt; Access control (IAM) &gt; Role assignments tab.</w:t>
       </w:r>
     </w:p>
     <w:p>
@@ -10471,7 +10521,7 @@
         <w:pStyle w:val="ListNumber"/>
       </w:pPr>
       <w:r>
-        <w:t>Tick the checkbox next to the **Reader** assignment for **az900.learner**.</w:t>
+        <w:t>Tick the checkbox next to the Reader assignment for az900.learner.</w:t>
       </w:r>
     </w:p>
     <w:p>
@@ -10479,7 +10529,7 @@
         <w:pStyle w:val="ListNumber"/>
       </w:pPr>
       <w:r>
-        <w:t>Click **Remove** (or **Delete**), then confirm.</w:t>
+        <w:t>Click Remove (or Delete), then confirm.</w:t>
       </w:r>
     </w:p>
     <w:p>
@@ -10503,7 +10553,7 @@
         <w:pStyle w:val="ListNumber"/>
       </w:pPr>
       <w:r>
-        <w:t>Confirm the Reader assignment for `az900.learner` on `rg-az900-labs` is removed (Step 9).</w:t>
+        <w:t>Confirm the Reader assignment for az900.learner on rg-az900-labs is removed (Step 9).</w:t>
       </w:r>
     </w:p>
     <w:p>
@@ -10511,7 +10561,7 @@
         <w:pStyle w:val="ListNumber"/>
       </w:pPr>
       <w:r>
-        <w:t>No resources were created in this lab, so nothing else to delete. Keep `rg-az900-labs`, the Lab 11 user and group - later labs still use them.</w:t>
+        <w:t>No resources were created in this lab, so nothing else to delete. Keep rg-az900-labs, the Lab 11 user and group - later labs still use them.</w:t>
       </w:r>
     </w:p>
     <w:p>
@@ -10527,7 +10577,7 @@
         <w:pStyle w:val="ListBullet"/>
       </w:pPr>
       <w:r>
-        <w:t>RBAC assignments combine a **security principal + role definition + scope**, and assignments inherit down from management group → subscription → resource group → resource.</w:t>
+        <w:t>RBAC assignments combine a security principal + role definition + scope, and assignments inherit down from management group → subscription → resource group → resource.</w:t>
       </w:r>
     </w:p>
     <w:p>
@@ -10535,7 +10585,7 @@
         <w:pStyle w:val="ListBullet"/>
       </w:pPr>
       <w:r>
-        <w:t>**Reader**, **Contributor** and **Owner** are the core built-in roles; only Owner can manage access for others.</w:t>
+        <w:t>Reader, Contributor and Owner are the core built-in roles; only Owner can manage access for others.</w:t>
       </w:r>
     </w:p>
     <w:p>
@@ -10543,7 +10593,7 @@
         <w:pStyle w:val="ListBullet"/>
       </w:pPr>
       <w:r>
-        <w:t>**Authentication** (Microsoft Entra ID verifies identity) is separate from **authorization** (RBAC decides permitted actions).</w:t>
+        <w:t>Authentication (Microsoft Entra ID verifies identity) is separate from authorization (RBAC decides permitted actions).</w:t>
       </w:r>
     </w:p>
     <w:p>
@@ -10559,7 +10609,7 @@
         <w:pStyle w:val="ListBullet"/>
       </w:pPr>
       <w:r>
-        <w:t>**Check access** and `az role assignment list` let you audit who can do what at a given scope.</w:t>
+        <w:t>Check access and az role assignment list let you audit who can do what at a given scope.</w:t>
       </w:r>
     </w:p>
     <w:p>
@@ -10622,7 +10672,7 @@
         <w:pStyle w:val="ListNumber"/>
       </w:pPr>
       <w:r>
-        <w:t>Search for **Resource groups**, open **rg-az900-labs** (create it in **Southeast Asia** if missing).</w:t>
+        <w:t>Search for Resource groups, open rg-az900-labs (create it in Southeast Asia if missing).</w:t>
       </w:r>
     </w:p>
     <w:p>
@@ -10630,7 +10680,7 @@
         <w:pStyle w:val="ListNumber"/>
       </w:pPr>
       <w:r>
-        <w:t>In the left menu, click **Tags**.</w:t>
+        <w:t>In the left menu, click Tags.</w:t>
       </w:r>
     </w:p>
     <w:p>
@@ -10638,7 +10688,7 @@
         <w:pStyle w:val="ListNumber"/>
       </w:pPr>
       <w:r>
-        <w:t>Enter the following name/value pairs, then click **Apply**:</w:t>
+        <w:t>Enter the following name/value pairs, then click Apply:</w:t>
       </w:r>
     </w:p>
     <w:p>
@@ -10716,7 +10766,7 @@
         <w:pStyle w:val="ListNumber"/>
       </w:pPr>
       <w:r>
-        <w:t>Still inside **rg-az900-labs**, open the **Overview** blade and click the Lab 9 storage account (`staz900...`).</w:t>
+        <w:t>Still inside rg-az900-labs, open the Overview blade and click the Lab 9 storage account (staz900...).</w:t>
       </w:r>
     </w:p>
     <w:p>
@@ -10724,7 +10774,7 @@
         <w:pStyle w:val="ListNumber"/>
       </w:pPr>
       <w:r>
-        <w:t>In its left menu, click **Tags** - the list is **empty**.</w:t>
+        <w:t>In its left menu, click Tags - the list is empty.</w:t>
       </w:r>
     </w:p>
     <w:p>
@@ -10775,7 +10825,7 @@
         <w:pStyle w:val="ListNumber"/>
       </w:pPr>
       <w:r>
-        <w:t>On the storage account's **Tags** blade, add:</w:t>
+        <w:t>On the storage account's Tags blade, add:</w:t>
       </w:r>
     </w:p>
     <w:p>
@@ -10783,7 +10833,7 @@
         <w:pStyle w:val="ListBullet"/>
       </w:pPr>
       <w:r>
-        <w:t>**Name**: `env`, **Value**: `training`</w:t>
+        <w:t>Name: env, Value: training</w:t>
       </w:r>
     </w:p>
     <w:p>
@@ -10791,7 +10841,7 @@
         <w:pStyle w:val="ListBullet"/>
       </w:pPr>
       <w:r>
-        <w:t>**Name**: `costcenter`, **Value**: `az900`</w:t>
+        <w:t>Name: costcenter, Value: az900</w:t>
       </w:r>
     </w:p>
     <w:p>
@@ -10799,7 +10849,7 @@
         <w:pStyle w:val="ListNumber"/>
       </w:pPr>
       <w:r>
-        <w:t>Click **Apply**.</w:t>
+        <w:t>Click Apply.</w:t>
       </w:r>
     </w:p>
     <w:p>
@@ -10823,7 +10873,7 @@
         <w:pStyle w:val="ListNumber"/>
       </w:pPr>
       <w:r>
-        <w:t>Search for **All resources** and open it.</w:t>
+        <w:t>Search for All resources and open it.</w:t>
       </w:r>
     </w:p>
     <w:p>
@@ -10831,7 +10881,7 @@
         <w:pStyle w:val="ListNumber"/>
       </w:pPr>
       <w:r>
-        <w:t>Click **+ Add filter**, choose **Filter**: `Tags`, then pick **Tag**: `env` and **Value**: `training`, and click **Apply**.</w:t>
+        <w:t>Click + Add filter, choose Filter: Tags, then pick Tag: env and Value: training, and click Apply.</w:t>
       </w:r>
     </w:p>
     <w:p>
@@ -11031,7 +11081,7 @@
         <w:pStyle w:val="ListNumber"/>
       </w:pPr>
       <w:r>
-        <w:t>Open **rg-az900-labs** &gt; left menu **Settings** &gt; **Locks**.</w:t>
+        <w:t>Open rg-az900-labs &gt; left menu Settings &gt; Locks.</w:t>
       </w:r>
     </w:p>
     <w:p>
@@ -11039,7 +11089,7 @@
         <w:pStyle w:val="ListNumber"/>
       </w:pPr>
       <w:r>
-        <w:t>Click **+ Add**:</w:t>
+        <w:t>Click + Add:</w:t>
       </w:r>
     </w:p>
     <w:p>
@@ -11047,7 +11097,7 @@
         <w:pStyle w:val="ListBullet"/>
       </w:pPr>
       <w:r>
-        <w:t>**Lock name**: `lock-az900-nodelete`</w:t>
+        <w:t>Lock name: lock-az900-nodelete</w:t>
       </w:r>
     </w:p>
     <w:p>
@@ -11055,7 +11105,7 @@
         <w:pStyle w:val="ListBullet"/>
       </w:pPr>
       <w:r>
-        <w:t>**Lock type**: `Delete`</w:t>
+        <w:t>Lock type: Delete</w:t>
       </w:r>
     </w:p>
     <w:p>
@@ -11063,7 +11113,7 @@
         <w:pStyle w:val="ListBullet"/>
       </w:pPr>
       <w:r>
-        <w:t>**Notes**: `AZ-900 lab - prevent accidental deletion`</w:t>
+        <w:t>Notes: AZ-900 lab - prevent accidental deletion</w:t>
       </w:r>
     </w:p>
     <w:p>
@@ -11071,7 +11121,7 @@
         <w:pStyle w:val="ListNumber"/>
       </w:pPr>
       <w:r>
-        <w:t>Click **OK**.</w:t>
+        <w:t>Click OK.</w:t>
       </w:r>
     </w:p>
     <w:p>
@@ -11108,7 +11158,7 @@
         <w:pStyle w:val="ListNumber"/>
       </w:pPr>
       <w:r>
-        <w:t>Open the storage account `staz900...` and click **Delete** on its Overview toolbar; type the account name to confirm.</w:t>
+        <w:t>Open the storage account staz900... and click Delete on its Overview toolbar; type the account name to confirm.</w:t>
       </w:r>
     </w:p>
     <w:p>
@@ -11124,7 +11174,7 @@
         <w:pStyle w:val="ListBullet"/>
       </w:pPr>
       <w:r>
-        <w:t>`The scope '.../resourceGroups/rg-az900-labs/providers/Microsoft.Storage/storageAccounts/staz900...' cannot perform delete operation because following scope(s) are locked: '/subscriptions/.../resourceGroups/rg-az900-labs'. Please remove the lock and try again.`</w:t>
+        <w:t>The scope '.../resourceGroups/rg-az900-labs/providers/Microsoft.Storage/storageAccounts/staz900...' cannot perform delete operation because following scope(s) are locked: '/subscriptions/.../resourceGroups/rg-az900-labs'. Please remove the lock and try again.</w:t>
       </w:r>
     </w:p>
     <w:p>
@@ -11248,7 +11298,7 @@
         <w:pStyle w:val="ListNumber"/>
       </w:pPr>
       <w:r>
-        <w:t>Go to **rg-az900-labs** &gt; **Settings** &gt; **Locks**.</w:t>
+        <w:t>Go to rg-az900-labs &gt; Settings &gt; Locks.</w:t>
       </w:r>
     </w:p>
     <w:p>
@@ -11256,7 +11306,7 @@
         <w:pStyle w:val="ListNumber"/>
       </w:pPr>
       <w:r>
-        <w:t>Click **Delete** next to `lock-az900-nodelete` and confirm.</w:t>
+        <w:t>Click Delete next to lock-az900-nodelete and confirm.</w:t>
       </w:r>
     </w:p>
     <w:p>
@@ -11313,7 +11363,7 @@
         <w:pStyle w:val="ListNumber"/>
       </w:pPr>
       <w:r>
-        <w:t>Ensure the lock `lock-az900-nodelete` is deleted (Step 9).</w:t>
+        <w:t>Ensure the lock lock-az900-nodelete is deleted (Step 9).</w:t>
       </w:r>
     </w:p>
     <w:p>
@@ -11321,7 +11371,7 @@
         <w:pStyle w:val="ListNumber"/>
       </w:pPr>
       <w:r>
-        <w:t>Leave the tags in place - they cost nothing and Lab 15 uses them when grouping costs. Keep `rg-az900-labs` and the storage account for the remaining labs.</w:t>
+        <w:t>Leave the tags in place - they cost nothing and Lab 15 uses them when grouping costs. Keep rg-az900-labs and the storage account for the remaining labs.</w:t>
       </w:r>
     </w:p>
     <w:p>
@@ -11345,7 +11395,7 @@
         <w:pStyle w:val="ListBullet"/>
       </w:pPr>
       <w:r>
-        <w:t>Resource-group tags are **not inherited** by child resources by default (only an Azure Policy can enforce inheritance).</w:t>
+        <w:t>Resource-group tags are not inherited by child resources by default (only an Azure Policy can enforce inheritance).</w:t>
       </w:r>
     </w:p>
     <w:p>
@@ -11353,7 +11403,7 @@
         <w:pStyle w:val="ListBullet"/>
       </w:pPr>
       <w:r>
-        <w:t>Resource locks (**Delete/CanNotDelete** and **Read-only/ReadOnly**) prevent accidental change and apply even to Owners, overriding RBAC permissions.</w:t>
+        <w:t>Resource locks (Delete/CanNotDelete and Read-only/ReadOnly) prevent accidental change and apply even to Owners, overriding RBAC permissions.</w:t>
       </w:r>
     </w:p>
     <w:p>
@@ -11432,7 +11482,7 @@
         <w:pStyle w:val="ListNumber"/>
       </w:pPr>
       <w:r>
-        <w:t>In the portal search bar, type **Policy** and open the **Policy** service.</w:t>
+        <w:t>In the portal search bar, type Policy and open the Policy service.</w:t>
       </w:r>
     </w:p>
     <w:p>
@@ -11440,7 +11490,7 @@
         <w:pStyle w:val="ListNumber"/>
       </w:pPr>
       <w:r>
-        <w:t>On the **Overview** blade, note the compliance summary for your subscription (likely 100% or "no assignments" if this is a fresh account).</w:t>
+        <w:t>On the Overview blade, note the compliance summary for your subscription (likely 100% or "no assignments" if this is a fresh account).</w:t>
       </w:r>
     </w:p>
     <w:p>
@@ -11464,7 +11514,7 @@
         <w:pStyle w:val="ListNumber"/>
       </w:pPr>
       <w:r>
-        <w:t>In the Policy left menu, under **Authoring**, click **Definitions**.</w:t>
+        <w:t>In the Policy left menu, under Authoring, click Definitions.</w:t>
       </w:r>
     </w:p>
     <w:p>
@@ -11472,7 +11522,7 @@
         <w:pStyle w:val="ListNumber"/>
       </w:pPr>
       <w:r>
-        <w:t>In the **Search** box type **Allowed locations** - open the built-in definition named **Allowed locations**.</w:t>
+        <w:t>In the Search box type Allowed locations - open the built-in definition named Allowed locations.</w:t>
       </w:r>
     </w:p>
     <w:p>
@@ -11480,7 +11530,7 @@
         <w:pStyle w:val="ListNumber"/>
       </w:pPr>
       <w:r>
-        <w:t>Read the description and click the **JSON** view: the rule denies any resource whose `location` is not in the `listOfAllowedLocations` parameter.</w:t>
+        <w:t>Read the description and click the JSON view: the rule denies any resource whose location is not in the listOfAllowedLocations parameter.</w:t>
       </w:r>
     </w:p>
     <w:p>
@@ -11488,7 +11538,7 @@
         <w:pStyle w:val="ListNumber"/>
       </w:pPr>
       <w:r>
-        <w:t>Go back and search **Require a tag on resources** - open it and note it denies creation of resources missing a given tag.</w:t>
+        <w:t>Go back and search Require a tag on resources - open it and note it denies creation of resources missing a given tag.</w:t>
       </w:r>
     </w:p>
     <w:p>
@@ -11525,7 +11575,7 @@
         <w:pStyle w:val="ListNumber"/>
       </w:pPr>
       <w:r>
-        <w:t>From the **Allowed locations** definition page, click **Assign policy** (or go to **Assignments** &gt; **Assign policy** and pick the definition).</w:t>
+        <w:t>From the Allowed locations definition page, click Assign policy (or go to Assignments &gt; Assign policy and pick the definition).</w:t>
       </w:r>
     </w:p>
     <w:p>
@@ -11533,7 +11583,7 @@
         <w:pStyle w:val="ListNumber"/>
       </w:pPr>
       <w:r>
-        <w:t>On the **Basics** tab:</w:t>
+        <w:t>On the Basics tab:</w:t>
       </w:r>
     </w:p>
     <w:p>
@@ -11541,7 +11591,7 @@
         <w:pStyle w:val="ListBullet"/>
       </w:pPr>
       <w:r>
-        <w:t>**Scope**: click the `...` button, select your subscription, then **Resource Group**: `rg-az900-labs`, click **Select**.</w:t>
+        <w:t>Scope: click the ... button, select your subscription, then Resource Group: rg-az900-labs, click Select.</w:t>
       </w:r>
     </w:p>
     <w:p>
@@ -11549,7 +11599,7 @@
         <w:pStyle w:val="ListBullet"/>
       </w:pPr>
       <w:r>
-        <w:t>**Assignment name**: leave as `Allowed locations`.</w:t>
+        <w:t>Assignment name: leave as Allowed locations.</w:t>
       </w:r>
     </w:p>
     <w:p>
@@ -11557,7 +11607,7 @@
         <w:pStyle w:val="ListNumber"/>
       </w:pPr>
       <w:r>
-        <w:t>On the **Parameters** tab:</w:t>
+        <w:t>On the Parameters tab:</w:t>
       </w:r>
     </w:p>
     <w:p>
@@ -11565,7 +11615,7 @@
         <w:pStyle w:val="ListBullet"/>
       </w:pPr>
       <w:r>
-        <w:t>**Allowed locations**: tick **Southeast Asia** and **East Asia** only.</w:t>
+        <w:t>Allowed locations: tick Southeast Asia and East Asia only.</w:t>
       </w:r>
     </w:p>
     <w:p>
@@ -11573,7 +11623,7 @@
         <w:pStyle w:val="ListNumber"/>
       </w:pPr>
       <w:r>
-        <w:t>Click **Review + create** &gt; **Create**.</w:t>
+        <w:t>Click Review + create &gt; Create.</w:t>
       </w:r>
     </w:p>
     <w:p>
@@ -11611,7 +11661,7 @@
         <w:pStyle w:val="ListNumber"/>
       </w:pPr>
       <w:r>
-        <w:t>Go to **Policy** &gt; **Assignments** and confirm the **Allowed locations** assignment is listed with scope `rg-az900-labs`.</w:t>
+        <w:t>Go to Policy &gt; Assignments and confirm the Allowed locations assignment is listed with scope rg-az900-labs.</w:t>
       </w:r>
     </w:p>
     <w:p>
@@ -11619,7 +11669,7 @@
         <w:pStyle w:val="ListNumber"/>
       </w:pPr>
       <w:r>
-        <w:t>Wait about **5 minutes** before testing - new assignments take a few minutes to propagate to the resource providers that enforce them.</w:t>
+        <w:t>Wait about 5 minutes before testing - new assignments take a few minutes to propagate to the resource providers that enforce them.</w:t>
       </w:r>
     </w:p>
     <w:p>
@@ -11656,7 +11706,7 @@
         <w:pStyle w:val="ListNumber"/>
       </w:pPr>
       <w:r>
-        <w:t>Open **rg-az900-labs** &gt; **+ Create**, search **Storage account**, click **Create**.</w:t>
+        <w:t>Open rg-az900-labs &gt; + Create, search Storage account, click Create.</w:t>
       </w:r>
     </w:p>
     <w:p>
@@ -11664,7 +11714,7 @@
         <w:pStyle w:val="ListNumber"/>
       </w:pPr>
       <w:r>
-        <w:t>On the **Basics** tab:</w:t>
+        <w:t>On the Basics tab:</w:t>
       </w:r>
     </w:p>
     <w:p>
@@ -11672,7 +11722,7 @@
         <w:pStyle w:val="ListBullet"/>
       </w:pPr>
       <w:r>
-        <w:t>**Resource group**: `rg-az900-labs`</w:t>
+        <w:t>Resource group: rg-az900-labs</w:t>
       </w:r>
     </w:p>
     <w:p>
@@ -11680,7 +11730,7 @@
         <w:pStyle w:val="ListBullet"/>
       </w:pPr>
       <w:r>
-        <w:t>**Storage account name**: `staz900policytest` plus random digits (lowercase, unique)</w:t>
+        <w:t>Storage account name: staz900policytest plus random digits (lowercase, unique)</w:t>
       </w:r>
     </w:p>
     <w:p>
@@ -11688,7 +11738,7 @@
         <w:pStyle w:val="ListBullet"/>
       </w:pPr>
       <w:r>
-        <w:t>**Region**: `West Europe`  ← deliberately not allowed</w:t>
+        <w:t>Region: West Europe  ← deliberately not allowed</w:t>
       </w:r>
     </w:p>
     <w:p>
@@ -11696,7 +11746,7 @@
         <w:pStyle w:val="ListBullet"/>
       </w:pPr>
       <w:r>
-        <w:t>**Redundancy**: `Locally-redundant storage (LRS)`</w:t>
+        <w:t>Redundancy: Locally-redundant storage (LRS)</w:t>
       </w:r>
     </w:p>
     <w:p>
@@ -11704,7 +11754,7 @@
         <w:pStyle w:val="ListNumber"/>
       </w:pPr>
       <w:r>
-        <w:t>Click **Review + create**. Validation fails (or the deployment is denied on **Create**) with an error like:</w:t>
+        <w:t>Click Review + create. Validation fails (or the deployment is denied on Create) with an error like:</w:t>
       </w:r>
     </w:p>
     <w:p>
@@ -11712,7 +11762,7 @@
         <w:pStyle w:val="ListBullet"/>
       </w:pPr>
       <w:r>
-        <w:t>`Resource 'staz900policytest...' was disallowed by policy. Policy identifiers: '[{"policyAssignment":{"name":"Allowed locations", ...}}]' (Code: RequestDisallowedByPolicy)`</w:t>
+        <w:t>Resource 'staz900policytest...' was disallowed by policy. Policy identifiers: '[{"policyAssignment":{"name":"Allowed locations", ...}}]' (Code: RequestDisallowedByPolicy)</w:t>
       </w:r>
     </w:p>
     <w:p>
@@ -11720,7 +11770,7 @@
         <w:pStyle w:val="ListNumber"/>
       </w:pPr>
       <w:r>
-        <w:t>Read the error - it names the exact **policy assignment** that blocked you. Cancel the deployment (do not retry with an allowed region).</w:t>
+        <w:t>Read the error - it names the exact policy assignment that blocked you. Cancel the deployment (do not retry with an allowed region).</w:t>
       </w:r>
     </w:p>
     <w:p>
@@ -11757,7 +11807,7 @@
         <w:pStyle w:val="ListNumber"/>
       </w:pPr>
       <w:r>
-        <w:t>Go to **Policy** &gt; **Compliance**.</w:t>
+        <w:t>Go to Policy &gt; Compliance.</w:t>
       </w:r>
     </w:p>
     <w:p>
@@ -11765,7 +11815,7 @@
         <w:pStyle w:val="ListNumber"/>
       </w:pPr>
       <w:r>
-        <w:t>Click the **Allowed locations** assignment to see its compliance state and the count of compliant resources (your existing Southeast Asia resources comply).</w:t>
+        <w:t>Click the Allowed locations assignment to see its compliance state and the count of compliant resources (your existing Southeast Asia resources comply).</w:t>
       </w:r>
     </w:p>
     <w:p>
@@ -11906,7 +11956,7 @@
         <w:pStyle w:val="ListNumber"/>
       </w:pPr>
       <w:r>
-        <w:t>Go to **Policy** &gt; **Assignments**.</w:t>
+        <w:t>Go to Policy &gt; Assignments.</w:t>
       </w:r>
     </w:p>
     <w:p>
@@ -11914,7 +11964,7 @@
         <w:pStyle w:val="ListNumber"/>
       </w:pPr>
       <w:r>
-        <w:t>Click the `...` at the right of the **Allowed locations** assignment and select **Delete assignment**, then confirm.</w:t>
+        <w:t>Click the ... at the right of the Allowed locations assignment and select Delete assignment, then confirm.</w:t>
       </w:r>
     </w:p>
     <w:p>
@@ -11960,7 +12010,7 @@
         <w:pStyle w:val="ListNumber"/>
       </w:pPr>
       <w:r>
-        <w:t>Confirm the **Allowed locations** assignment is deleted (Step 8) - the built-in *definition* stays, only your *assignment* is removed.</w:t>
+        <w:t>Confirm the Allowed locations assignment is deleted (Step 8) - the built-in *definition* stays, only your *assignment* is removed.</w:t>
       </w:r>
     </w:p>
     <w:p>
@@ -11968,7 +12018,7 @@
         <w:pStyle w:val="ListNumber"/>
       </w:pPr>
       <w:r>
-        <w:t>No resources were created (the test deployment was denied), so nothing else to delete. Keep `rg-az900-labs` for the remaining labs.</w:t>
+        <w:t>No resources were created (the test deployment was denied), so nothing else to delete. Keep rg-az900-labs for the remaining labs.</w:t>
       </w:r>
     </w:p>
     <w:p>
@@ -11984,7 +12034,7 @@
         <w:pStyle w:val="ListBullet"/>
       </w:pPr>
       <w:r>
-        <w:t>Azure Policy enforces organisational standards (allowed regions, required tags, allowed SKUs) and continuously assesses **compliance**.</w:t>
+        <w:t>Azure Policy enforces organisational standards (allowed regions, required tags, allowed SKUs) and continuously assesses compliance.</w:t>
       </w:r>
     </w:p>
     <w:p>
@@ -11992,7 +12042,7 @@
         <w:pStyle w:val="ListBullet"/>
       </w:pPr>
       <w:r>
-        <w:t>A policy is a **definition** (the rule) plus an **assignment** (the rule applied at a scope); initiatives bundle related definitions.</w:t>
+        <w:t>A policy is a definition (the rule) plus an assignment (the rule applied at a scope); initiatives bundle related definitions.</w:t>
       </w:r>
     </w:p>
     <w:p>
@@ -12000,7 +12050,7 @@
         <w:pStyle w:val="ListBullet"/>
       </w:pPr>
       <w:r>
-        <w:t>Policy assignments inherit down the scope hierarchy just like RBAC, but apply to **all users including Owners**.</w:t>
+        <w:t>Policy assignments inherit down the scope hierarchy just like RBAC, but apply to all users including Owners.</w:t>
       </w:r>
     </w:p>
     <w:p>
@@ -12008,7 +12058,7 @@
         <w:pStyle w:val="ListBullet"/>
       </w:pPr>
       <w:r>
-        <w:t>Deny-effect policies block non-compliant deployments with `RequestDisallowedByPolicy`, naming the assignment responsible.</w:t>
+        <w:t>Deny-effect policies block non-compliant deployments with RequestDisallowedByPolicy, naming the assignment responsible.</w:t>
       </w:r>
     </w:p>
     <w:p>
@@ -12087,7 +12137,7 @@
         <w:pStyle w:val="ListNumber"/>
       </w:pPr>
       <w:r>
-        <w:t>On the **Products** tab, click the **Virtual Machines** tile - it is added to your estimate at the bottom of the page.</w:t>
+        <w:t>On the Products tab, click the Virtual Machines tile - it is added to your estimate at the bottom of the page.</w:t>
       </w:r>
     </w:p>
     <w:p>
@@ -12095,7 +12145,7 @@
         <w:pStyle w:val="ListNumber"/>
       </w:pPr>
       <w:r>
-        <w:t>Scroll down to the **Virtual Machines** section of the estimate and configure:</w:t>
+        <w:t>Scroll down to the Virtual Machines section of the estimate and configure:</w:t>
       </w:r>
     </w:p>
     <w:p>
@@ -12183,7 +12233,7 @@
         <w:pStyle w:val="ListNumber"/>
       </w:pPr>
       <w:r>
-        <w:t>Scroll back to the top, on the **Products** tab click **Storage Accounts**.</w:t>
+        <w:t>Scroll back to the top, on the Products tab click Storage Accounts.</w:t>
       </w:r>
     </w:p>
     <w:p>
@@ -12191,7 +12241,7 @@
         <w:pStyle w:val="ListNumber"/>
       </w:pPr>
       <w:r>
-        <w:t>In the new **Storage Accounts** section of the estimate set:</w:t>
+        <w:t>In the new Storage Accounts section of the estimate set:</w:t>
       </w:r>
     </w:p>
     <w:p>
@@ -12199,7 +12249,7 @@
         <w:pStyle w:val="ListBullet"/>
       </w:pPr>
       <w:r>
-        <w:t>**Region**: `Southeast Asia`</w:t>
+        <w:t>Region: Southeast Asia</w:t>
       </w:r>
     </w:p>
     <w:p>
@@ -12207,7 +12257,7 @@
         <w:pStyle w:val="ListBullet"/>
       </w:pPr>
       <w:r>
-        <w:t>**Type**: `Block Blob Storage`, **Performance tier**: `Standard`, **Redundancy**: `LRS`</w:t>
+        <w:t>Type: Block Blob Storage, Performance tier: Standard, Redundancy: LRS</w:t>
       </w:r>
     </w:p>
     <w:p>
@@ -12215,7 +12265,7 @@
         <w:pStyle w:val="ListBullet"/>
       </w:pPr>
       <w:r>
-        <w:t>**Capacity**: `100 GB`</w:t>
+        <w:t>Capacity: 100 GB</w:t>
       </w:r>
     </w:p>
     <w:p>
@@ -12223,7 +12273,7 @@
         <w:pStyle w:val="ListNumber"/>
       </w:pPr>
       <w:r>
-        <w:t>Observe the running **Estimated monthly cost** total at the bottom.</w:t>
+        <w:t>Observe the running Estimated monthly cost total at the bottom.</w:t>
       </w:r>
     </w:p>
     <w:p>
@@ -12247,7 +12297,7 @@
         <w:pStyle w:val="ListNumber"/>
       </w:pPr>
       <w:r>
-        <w:t>In the Virtual Machines section, find the **Savings options** area.</w:t>
+        <w:t>In the Virtual Machines section, find the Savings options area.</w:t>
       </w:r>
     </w:p>
     <w:p>
@@ -12263,7 +12313,7 @@
         <w:pStyle w:val="ListBullet"/>
       </w:pPr>
       <w:r>
-        <w:t>**Pay as you go**</w:t>
+        <w:t>Pay as you go</w:t>
       </w:r>
     </w:p>
     <w:p>
@@ -12271,7 +12321,7 @@
         <w:pStyle w:val="ListBullet"/>
       </w:pPr>
       <w:r>
-        <w:t>**1 year savings plan** (or **1 year reserved**)</w:t>
+        <w:t>1 year savings plan (or 1 year reserved)</w:t>
       </w:r>
     </w:p>
     <w:p>
@@ -12279,7 +12329,7 @@
         <w:pStyle w:val="ListBullet"/>
       </w:pPr>
       <w:r>
-        <w:t>**3 year reserved**</w:t>
+        <w:t>3 year reserved</w:t>
       </w:r>
     </w:p>
     <w:p>
@@ -12295,7 +12345,7 @@
         <w:pStyle w:val="ListNumber"/>
       </w:pPr>
       <w:r>
-        <w:t>Also try changing **Region** to `West US` or `West Europe` and watch the price change, then set it back to `Southeast Asia`.</w:t>
+        <w:t>Also try changing Region to West US or West Europe and watch the price change, then set it back to Southeast Asia.</w:t>
       </w:r>
     </w:p>
     <w:p>
@@ -12332,7 +12382,7 @@
         <w:pStyle w:val="ListNumber"/>
       </w:pPr>
       <w:r>
-        <w:t>At the bottom of the estimate, click **Export** to download the estimate as an Excel file, or</w:t>
+        <w:t>At the bottom of the estimate, click Export to download the estimate as an Excel file, or</w:t>
       </w:r>
     </w:p>
     <w:p>
@@ -12340,7 +12390,7 @@
         <w:pStyle w:val="ListNumber"/>
       </w:pPr>
       <w:r>
-        <w:t>Click **Save** then **Share** to generate a link (requires sign-in).</w:t>
+        <w:t>Click Save then Share to generate a link (requires sign-in).</w:t>
       </w:r>
     </w:p>
     <w:p>
@@ -12372,7 +12422,7 @@
         <w:pStyle w:val="ListNumber"/>
       </w:pPr>
       <w:r>
-        <w:t>Under **Define your workloads** &gt; **Servers**, click **+ Add server workload**:</w:t>
+        <w:t>Under Define your workloads &gt; Servers, click + Add server workload:</w:t>
       </w:r>
     </w:p>
     <w:p>
@@ -12380,7 +12430,7 @@
         <w:pStyle w:val="ListBullet"/>
       </w:pPr>
       <w:r>
-        <w:t>**Name**: `On-prem web servers`</w:t>
+        <w:t>Name: On-prem web servers</w:t>
       </w:r>
     </w:p>
     <w:p>
@@ -12388,7 +12438,7 @@
         <w:pStyle w:val="ListBullet"/>
       </w:pPr>
       <w:r>
-        <w:t>**Workload**: `Windows/Linux Server`, **Environment**: `Virtual machines`</w:t>
+        <w:t>Workload: Windows/Linux Server, Environment: Virtual machines</w:t>
       </w:r>
     </w:p>
     <w:p>
@@ -12396,7 +12446,7 @@
         <w:pStyle w:val="ListBullet"/>
       </w:pPr>
       <w:r>
-        <w:t>**Operating system**: `Windows`, **VMs**: `2`, **Cores per VM**: `2`, **RAM per VM**: `8` GB</w:t>
+        <w:t>Operating system: Windows, VMs: 2, Cores per VM: 2, RAM per VM: 8 GB</w:t>
       </w:r>
     </w:p>
     <w:p>
@@ -12404,7 +12454,7 @@
         <w:pStyle w:val="ListNumber"/>
       </w:pPr>
       <w:r>
-        <w:t>Under **Storage**, click **+ Add storage**:</w:t>
+        <w:t>Under Storage, click + Add storage:</w:t>
       </w:r>
     </w:p>
     <w:p>
@@ -12412,7 +12462,7 @@
         <w:pStyle w:val="ListBullet"/>
       </w:pPr>
       <w:r>
-        <w:t>**Name**: `On-prem SAN`, **Storage type**: `Local Disk/SAN`, **Disk type**: `HDD`, **Capacity**: `1` TB</w:t>
+        <w:t>Name: On-prem SAN, Storage type: Local Disk/SAN, Disk type: HDD, Capacity: 1 TB</w:t>
       </w:r>
     </w:p>
     <w:p>
@@ -12420,7 +12470,7 @@
         <w:pStyle w:val="ListNumber"/>
       </w:pPr>
       <w:r>
-        <w:t>Leave **Networking** at defaults and click **Next**.</w:t>
+        <w:t>Leave Networking at defaults and click Next.</w:t>
       </w:r>
     </w:p>
     <w:p>
@@ -12444,7 +12494,7 @@
         <w:pStyle w:val="ListNumber"/>
       </w:pPr>
       <w:r>
-        <w:t>On the **Adjust assumptions** page, review the defaults (electricity price, IT labour cost, virtualisation ratio) and click **Next**.</w:t>
+        <w:t>On the Adjust assumptions page, review the defaults (electricity price, IT labour cost, virtualisation ratio) and click Next.</w:t>
       </w:r>
     </w:p>
     <w:p>
@@ -12452,7 +12502,7 @@
         <w:pStyle w:val="ListNumber"/>
       </w:pPr>
       <w:r>
-        <w:t>On the **View report** page, set **Timeframe**: `5 years` and **Region**: `Southeast Asia`.</w:t>
+        <w:t>On the View report page, set Timeframe: 5 years and Region: Southeast Asia.</w:t>
       </w:r>
     </w:p>
     <w:p>
@@ -12460,7 +12510,7 @@
         <w:pStyle w:val="ListNumber"/>
       </w:pPr>
       <w:r>
-        <w:t>Review the chart comparing **total cost of running on-premises** vs **cost of the equivalent in Azure**, and the per-category breakdown (compute, data centre, networking, storage, IT labour).</w:t>
+        <w:t>Review the chart comparing total cost of running on-premises vs cost of the equivalent in Azure, and the per-category breakdown (compute, data centre, networking, storage, IT labour).</w:t>
       </w:r>
     </w:p>
     <w:p>
@@ -12468,7 +12518,7 @@
         <w:pStyle w:val="ListNumber"/>
       </w:pPr>
       <w:r>
-        <w:t>Optionally click **Download** to save the report as PDF.</w:t>
+        <w:t>Optionally click Download to save the report as PDF.</w:t>
       </w:r>
     </w:p>
     <w:p>
@@ -12492,7 +12542,7 @@
         <w:pStyle w:val="ListNumber"/>
       </w:pPr>
       <w:r>
-        <w:t>Back in https://portal.azure.com, search **Cost Management + Billing** and open it.</w:t>
+        <w:t>Back in https://portal.azure.com, search Cost Management + Billing and open it.</w:t>
       </w:r>
     </w:p>
     <w:p>
@@ -12500,7 +12550,7 @@
         <w:pStyle w:val="ListNumber"/>
       </w:pPr>
       <w:r>
-        <w:t>Click **Cost Management** &gt; **Cost analysis** (scope: your subscription).</w:t>
+        <w:t>Click Cost Management &gt; Cost analysis (scope: your subscription).</w:t>
       </w:r>
     </w:p>
     <w:p>
@@ -12516,7 +12566,7 @@
         <w:pStyle w:val="ListNumber"/>
       </w:pPr>
       <w:r>
-        <w:t>Change **Group by** to `Resource` to see which resources are generating cost; also try `Tag` &gt; `costcenter` to see your Lab 13 tags at work.</w:t>
+        <w:t>Change Group by to Resource to see which resources are generating cost; also try Tag &gt; costcenter to see your Lab 13 tags at work.</w:t>
       </w:r>
     </w:p>
     <w:p>
@@ -12540,7 +12590,7 @@
         <w:pStyle w:val="ListNumber"/>
       </w:pPr>
       <w:r>
-        <w:t>In **Cost Management**, click **Budgets** &gt; **+ Add**.</w:t>
+        <w:t>In Cost Management, click Budgets &gt; + Add.</w:t>
       </w:r>
     </w:p>
     <w:p>
@@ -12548,7 +12598,7 @@
         <w:pStyle w:val="ListNumber"/>
       </w:pPr>
       <w:r>
-        <w:t>On the **Create budget** page:</w:t>
+        <w:t>On the Create budget page:</w:t>
       </w:r>
     </w:p>
     <w:p>
@@ -12556,7 +12606,7 @@
         <w:pStyle w:val="ListBullet"/>
       </w:pPr>
       <w:r>
-        <w:t>**Scope**: your subscription</w:t>
+        <w:t>Scope: your subscription</w:t>
       </w:r>
     </w:p>
     <w:p>
@@ -12564,7 +12614,7 @@
         <w:pStyle w:val="ListBullet"/>
       </w:pPr>
       <w:r>
-        <w:t>**Name**: `budget-az900`</w:t>
+        <w:t>Name: budget-az900</w:t>
       </w:r>
     </w:p>
     <w:p>
@@ -12572,7 +12622,7 @@
         <w:pStyle w:val="ListBullet"/>
       </w:pPr>
       <w:r>
-        <w:t>**Reset period**: `Billing month`</w:t>
+        <w:t>Reset period: Billing month</w:t>
       </w:r>
     </w:p>
     <w:p>
@@ -12580,7 +12630,7 @@
         <w:pStyle w:val="ListBullet"/>
       </w:pPr>
       <w:r>
-        <w:t>**Amount ($)**: `20`</w:t>
+        <w:t>Amount ($): 20</w:t>
       </w:r>
     </w:p>
     <w:p>
@@ -12588,7 +12638,7 @@
         <w:pStyle w:val="ListNumber"/>
       </w:pPr>
       <w:r>
-        <w:t>Click **Next** to the **Set alerts** tab:</w:t>
+        <w:t>Click Next to the Set alerts tab:</w:t>
       </w:r>
     </w:p>
     <w:p>
@@ -12596,7 +12646,7 @@
         <w:pStyle w:val="ListBullet"/>
       </w:pPr>
       <w:r>
-        <w:t>**Alert conditions** - **Type**: `Actual`, **% of budget**: `80` (i.e. alert at $16 actual spend)</w:t>
+        <w:t>Alert conditions - Type: Actual, % of budget: 80 (i.e. alert at $16 actual spend)</w:t>
       </w:r>
     </w:p>
     <w:p>
@@ -12604,7 +12654,7 @@
         <w:pStyle w:val="ListBullet"/>
       </w:pPr>
       <w:r>
-        <w:t>**Alert recipients (email)**: your email address</w:t>
+        <w:t>Alert recipients (email): your email address</w:t>
       </w:r>
     </w:p>
     <w:p>
@@ -12612,7 +12662,7 @@
         <w:pStyle w:val="ListNumber"/>
       </w:pPr>
       <w:r>
-        <w:t>Click **Create**.</w:t>
+        <w:t>Click Create.</w:t>
       </w:r>
     </w:p>
     <w:p>
@@ -12726,7 +12776,7 @@
         <w:pStyle w:val="ListNumber"/>
       </w:pPr>
       <w:r>
-        <w:t>In **Cost Management** &gt; **Budgets**, you may keep `budget-az900` (it is free and useful) - or select it, click the `...` menu and **Delete** it now.</w:t>
+        <w:t>In Cost Management &gt; Budgets, you may keep budget-az900 (it is free and useful) - or select it, click the ... menu and Delete it now.</w:t>
       </w:r>
     </w:p>
     <w:p>
@@ -12742,7 +12792,7 @@
         <w:pStyle w:val="ListNumber"/>
       </w:pPr>
       <w:r>
-        <w:t>Keep `rg-az900-labs` and its resources - Lab 16 performs the final course clean-up.</w:t>
+        <w:t>Keep rg-az900-labs and its resources - Lab 16 performs the final course clean-up.</w:t>
       </w:r>
     </w:p>
     <w:p>
@@ -12758,7 +12808,7 @@
         <w:pStyle w:val="ListBullet"/>
       </w:pPr>
       <w:r>
-        <w:t>The **Pricing Calculator** estimates the monthly cost of Azure services before deployment; the **TCO Calculator** compares full on-premises ownership costs (hardware, power, labour) against Azure over multiple years.</w:t>
+        <w:t>The Pricing Calculator estimates the monthly cost of Azure services before deployment; the TCO Calculator compares full on-premises ownership costs (hardware, power, labour) against Azure over multiple years.</w:t>
       </w:r>
     </w:p>
     <w:p>
@@ -12766,7 +12816,7 @@
         <w:pStyle w:val="ListBullet"/>
       </w:pPr>
       <w:r>
-        <w:t>Cost is driven by resource type/size, consumption, **region**, commitment model (pay-as-you-go vs savings plan vs reservation) and network egress.</w:t>
+        <w:t>Cost is driven by resource type/size, consumption, region, commitment model (pay-as-you-go vs savings plan vs reservation) and network egress.</w:t>
       </w:r>
     </w:p>
     <w:p>
@@ -12782,7 +12832,7 @@
         <w:pStyle w:val="ListBullet"/>
       </w:pPr>
       <w:r>
-        <w:t>**Cost analysis** breaks real spend down by resource, service or tag - tags applied in Lab 13 become cost-reporting dimensions.</w:t>
+        <w:t>Cost analysis breaks real spend down by resource, service or tag - tags applied in Lab 13 become cost-reporting dimensions.</w:t>
       </w:r>
     </w:p>
     <w:p>
@@ -12790,7 +12840,7 @@
         <w:pStyle w:val="ListBullet"/>
       </w:pPr>
       <w:r>
-        <w:t>**Budgets** with alert thresholds notify you at defined spend levels but do not block spending on their own.</w:t>
+        <w:t>Budgets with alert thresholds notify you at defined spend levels but do not block spending on their own.</w:t>
       </w:r>
     </w:p>
     <w:p>
@@ -12853,7 +12903,7 @@
         <w:pStyle w:val="ListNumber"/>
       </w:pPr>
       <w:r>
-        <w:t>In the portal search bar, type **Advisor** and open **Azure Advisor**.</w:t>
+        <w:t>In the portal search bar, type Advisor and open Azure Advisor.</w:t>
       </w:r>
     </w:p>
     <w:p>
@@ -12861,7 +12911,7 @@
         <w:pStyle w:val="ListNumber"/>
       </w:pPr>
       <w:r>
-        <w:t>On the **Overview** blade, note the five recommendation categories, each with a score/count:</w:t>
+        <w:t>On the Overview blade, note the five recommendation categories, each with a score/count:</w:t>
       </w:r>
     </w:p>
     <w:p>
@@ -12869,7 +12919,7 @@
         <w:pStyle w:val="ListBullet"/>
       </w:pPr>
       <w:r>
-        <w:t>**Cost** - e.g. shut down or resize under-used VMs</w:t>
+        <w:t>Cost - e.g. shut down or resize under-used VMs</w:t>
       </w:r>
     </w:p>
     <w:p>
@@ -12877,7 +12927,7 @@
         <w:pStyle w:val="ListBullet"/>
       </w:pPr>
       <w:r>
-        <w:t>**Security** - findings sourced from Microsoft Defender for Cloud</w:t>
+        <w:t>Security - findings sourced from Microsoft Defender for Cloud</w:t>
       </w:r>
     </w:p>
     <w:p>
@@ -12885,7 +12935,7 @@
         <w:pStyle w:val="ListBullet"/>
       </w:pPr>
       <w:r>
-        <w:t>**Reliability** - e.g. enable backups, add redundancy</w:t>
+        <w:t>Reliability - e.g. enable backups, add redundancy</w:t>
       </w:r>
     </w:p>
     <w:p>
@@ -12893,7 +12943,7 @@
         <w:pStyle w:val="ListBullet"/>
       </w:pPr>
       <w:r>
-        <w:t>**Operational excellence** - e.g. use resource locks, follow deployment best practice</w:t>
+        <w:t>Operational excellence - e.g. use resource locks, follow deployment best practice</w:t>
       </w:r>
     </w:p>
     <w:p>
@@ -12901,7 +12951,7 @@
         <w:pStyle w:val="ListBullet"/>
       </w:pPr>
       <w:r>
-        <w:t>**Performance** - e.g. upgrade SKUs or storage tiers for speed</w:t>
+        <w:t>Performance - e.g. upgrade SKUs or storage tiers for speed</w:t>
       </w:r>
     </w:p>
     <w:p>
@@ -12909,7 +12959,7 @@
         <w:pStyle w:val="ListNumber"/>
       </w:pPr>
       <w:r>
-        <w:t>Click into one category (e.g. **Cost**) and open any recommendation to see the affected resource and suggested action.</w:t>
+        <w:t>Click into one category (e.g. Cost) and open any recommendation to see the affected resource and suggested action.</w:t>
       </w:r>
     </w:p>
     <w:p>
@@ -12933,7 +12983,7 @@
         <w:pStyle w:val="ListNumber"/>
       </w:pPr>
       <w:r>
-        <w:t>On the Advisor **Overview** (or any category blade), click **Download as CSV** in the toolbar.</w:t>
+        <w:t>On the Advisor Overview (or any category blade), click Download as CSV in the toolbar.</w:t>
       </w:r>
     </w:p>
     <w:p>
@@ -12965,7 +13015,7 @@
         <w:pStyle w:val="ListNumber"/>
       </w:pPr>
       <w:r>
-        <w:t>Search **Service Health** and open it.</w:t>
+        <w:t>Search Service Health and open it.</w:t>
       </w:r>
     </w:p>
     <w:p>
@@ -12981,7 +13031,7 @@
         <w:pStyle w:val="ListBullet"/>
       </w:pPr>
       <w:r>
-        <w:t>**Service issues** - active Azure platform outages affecting *your* subscriptions/regions (usually "No active events" - good news)</w:t>
+        <w:t>Service issues - active Azure platform outages affecting *your* subscriptions/regions (usually "No active events" - good news)</w:t>
       </w:r>
     </w:p>
     <w:p>
@@ -12989,7 +13039,7 @@
         <w:pStyle w:val="ListBullet"/>
       </w:pPr>
       <w:r>
-        <w:t>**Planned maintenance** - upcoming Microsoft maintenance windows</w:t>
+        <w:t>Planned maintenance - upcoming Microsoft maintenance windows</w:t>
       </w:r>
     </w:p>
     <w:p>
@@ -12997,7 +13047,7 @@
         <w:pStyle w:val="ListBullet"/>
       </w:pPr>
       <w:r>
-        <w:t>**Health advisories** - changes needing action, e.g. service retirements</w:t>
+        <w:t>Health advisories - changes needing action, e.g. service retirements</w:t>
       </w:r>
     </w:p>
     <w:p>
@@ -13005,7 +13055,7 @@
         <w:pStyle w:val="ListBullet"/>
       </w:pPr>
       <w:r>
-        <w:t>**Health history** - past events</w:t>
+        <w:t>Health history - past events</w:t>
       </w:r>
     </w:p>
     <w:p>
@@ -13013,7 +13063,7 @@
         <w:pStyle w:val="ListNumber"/>
       </w:pPr>
       <w:r>
-        <w:t>Compare with **Azure status** (https://azure.status.microsoft) - that page shows global platform health for everyone; Service Health is *personalised* to your resources.</w:t>
+        <w:t>Compare with Azure status (https://azure.status.microsoft) - that page shows global platform health for everyone; Service Health is *personalised* to your resources.</w:t>
       </w:r>
     </w:p>
     <w:p>
@@ -13037,7 +13087,7 @@
         <w:pStyle w:val="ListNumber"/>
       </w:pPr>
       <w:r>
-        <w:t>In **Service Health**, click **Health alerts** &gt; **+ Add service health alert** (this opens the alert rule creation wizard; you will create the action group inside it).</w:t>
+        <w:t>In Service Health, click Health alerts &gt; + Add service health alert (this opens the alert rule creation wizard; you will create the action group inside it).</w:t>
       </w:r>
     </w:p>
     <w:p>
@@ -13045,7 +13095,7 @@
         <w:pStyle w:val="ListNumber"/>
       </w:pPr>
       <w:r>
-        <w:t>On the **Condition** tab set:</w:t>
+        <w:t>On the Condition tab set:</w:t>
       </w:r>
     </w:p>
     <w:p>
@@ -13053,7 +13103,7 @@
         <w:pStyle w:val="ListBullet"/>
       </w:pPr>
       <w:r>
-        <w:t>**Subscription**: your subscription</w:t>
+        <w:t>Subscription: your subscription</w:t>
       </w:r>
     </w:p>
     <w:p>
@@ -13061,7 +13111,7 @@
         <w:pStyle w:val="ListBullet"/>
       </w:pPr>
       <w:r>
-        <w:t>**Services**: `Select all`</w:t>
+        <w:t>Services: Select all</w:t>
       </w:r>
     </w:p>
     <w:p>
@@ -13069,7 +13119,7 @@
         <w:pStyle w:val="ListBullet"/>
       </w:pPr>
       <w:r>
-        <w:t>**Regions**: untick all, tick **Southeast Asia** only</w:t>
+        <w:t>Regions: untick all, tick Southeast Asia only</w:t>
       </w:r>
     </w:p>
     <w:p>
@@ -13077,7 +13127,7 @@
         <w:pStyle w:val="ListBullet"/>
       </w:pPr>
       <w:r>
-        <w:t>**Event types**: `Select all` (Service issue, Planned maintenance, Health advisories, Security advisory)</w:t>
+        <w:t>Event types: Select all (Service issue, Planned maintenance, Health advisories, Security advisory)</w:t>
       </w:r>
     </w:p>
     <w:p>
@@ -13085,7 +13135,7 @@
         <w:pStyle w:val="ListNumber"/>
       </w:pPr>
       <w:r>
-        <w:t>Go to the **Actions** tab and click **+ Create action group**:</w:t>
+        <w:t>Go to the Actions tab and click + Create action group:</w:t>
       </w:r>
     </w:p>
     <w:p>
@@ -13093,7 +13143,7 @@
         <w:pStyle w:val="ListBullet"/>
       </w:pPr>
       <w:r>
-        <w:t>**Resource group**: `rg-az900-labs`</w:t>
+        <w:t>Resource group: rg-az900-labs</w:t>
       </w:r>
     </w:p>
     <w:p>
@@ -13101,7 +13151,7 @@
         <w:pStyle w:val="ListBullet"/>
       </w:pPr>
       <w:r>
-        <w:t>**Action group name**: `ag-az900-email`</w:t>
+        <w:t>Action group name: ag-az900-email</w:t>
       </w:r>
     </w:p>
     <w:p>
@@ -13109,7 +13159,7 @@
         <w:pStyle w:val="ListBullet"/>
       </w:pPr>
       <w:r>
-        <w:t>**Display name**: `az900email`</w:t>
+        <w:t>Display name: az900email</w:t>
       </w:r>
     </w:p>
     <w:p>
@@ -13117,7 +13167,7 @@
         <w:pStyle w:val="ListBullet"/>
       </w:pPr>
       <w:r>
-        <w:t>On the **Notifications** tab: **Notification type**: `Email/SMS message/Push/Voice`, **Name**: `email-me`, tick **Email** and enter your email address, click **OK**.</w:t>
+        <w:t>On the Notifications tab: Notification type: Email/SMS message/Push/Voice, Name: email-me, tick Email and enter your email address, click OK.</w:t>
       </w:r>
     </w:p>
     <w:p>
@@ -13125,7 +13175,7 @@
         <w:pStyle w:val="ListBullet"/>
       </w:pPr>
       <w:r>
-        <w:t>Click **Review + create** &gt; **Create**.</w:t>
+        <w:t>Click Review + create &gt; Create.</w:t>
       </w:r>
     </w:p>
     <w:p>
@@ -13149,7 +13199,7 @@
         <w:pStyle w:val="ListNumber"/>
       </w:pPr>
       <w:r>
-        <w:t>Back on the alert wizard's **Actions** tab, confirm `ag-az900-email` is selected.</w:t>
+        <w:t>Back on the alert wizard's Actions tab, confirm ag-az900-email is selected.</w:t>
       </w:r>
     </w:p>
     <w:p>
@@ -13157,7 +13207,7 @@
         <w:pStyle w:val="ListNumber"/>
       </w:pPr>
       <w:r>
-        <w:t>On the **Details** tab:</w:t>
+        <w:t>On the Details tab:</w:t>
       </w:r>
     </w:p>
     <w:p>
@@ -13165,7 +13215,7 @@
         <w:pStyle w:val="ListBullet"/>
       </w:pPr>
       <w:r>
-        <w:t>**Resource group**: `rg-az900-labs`</w:t>
+        <w:t>Resource group: rg-az900-labs</w:t>
       </w:r>
     </w:p>
     <w:p>
@@ -13173,7 +13223,7 @@
         <w:pStyle w:val="ListBullet"/>
       </w:pPr>
       <w:r>
-        <w:t>**Alert rule name**: `alert-servicehealth-sea`</w:t>
+        <w:t>Alert rule name: alert-servicehealth-sea</w:t>
       </w:r>
     </w:p>
     <w:p>
@@ -13181,7 +13231,7 @@
         <w:pStyle w:val="ListNumber"/>
       </w:pPr>
       <w:r>
-        <w:t>Click **Review + create** &gt; **Create**.</w:t>
+        <w:t>Click Review + create &gt; Create.</w:t>
       </w:r>
     </w:p>
     <w:p>
@@ -13213,7 +13263,7 @@
         <w:pStyle w:val="ListNumber"/>
       </w:pPr>
       <w:r>
-        <w:t>Search **Monitor** and open **Azure Monitor**, then click **Metrics**.</w:t>
+        <w:t>Search Monitor and open Azure Monitor, then click Metrics.</w:t>
       </w:r>
     </w:p>
     <w:p>
@@ -13221,7 +13271,7 @@
         <w:pStyle w:val="ListNumber"/>
       </w:pPr>
       <w:r>
-        <w:t>In the **Select a scope** pane, expand your subscription &gt; `rg-az900-labs` and select a resource:</w:t>
+        <w:t>In the Select a scope pane, expand your subscription &gt; rg-az900-labs and select a resource:</w:t>
       </w:r>
     </w:p>
     <w:p>
@@ -13229,7 +13279,7 @@
         <w:pStyle w:val="ListBullet"/>
       </w:pPr>
       <w:r>
-        <w:t>If a VM still exists from earlier labs: select it, **Metric**: `Percentage CPU`, **Aggregation**: `Avg`.</w:t>
+        <w:t>If a VM still exists from earlier labs: select it, Metric: Percentage CPU, Aggregation: Avg.</w:t>
       </w:r>
     </w:p>
     <w:p>
@@ -13237,7 +13287,7 @@
         <w:pStyle w:val="ListBullet"/>
       </w:pPr>
       <w:r>
-        <w:t>Otherwise select the Lab 9 storage account `staz900...`, **Metric namespace**: `Account`, **Metric**: `Transactions`, **Aggregation**: `Sum`.</w:t>
+        <w:t>Otherwise select the Lab 9 storage account staz900..., Metric namespace: Account, Metric: Transactions, Aggregation: Sum.</w:t>
       </w:r>
     </w:p>
     <w:p>
@@ -13245,7 +13295,7 @@
         <w:pStyle w:val="ListNumber"/>
       </w:pPr>
       <w:r>
-        <w:t>Change the time range (top right) to **Last 24 hours** and watch the chart update.</w:t>
+        <w:t>Change the time range (top right) to Last 24 hours and watch the chart update.</w:t>
       </w:r>
     </w:p>
     <w:p>
@@ -13253,7 +13303,7 @@
         <w:pStyle w:val="ListNumber"/>
       </w:pPr>
       <w:r>
-        <w:t>Click **Save to dashboard** &gt; **Pin to dashboard** &gt; **Create new** &gt; name it `AZ900 Ops` &gt; **Pin**.</w:t>
+        <w:t>Click Save to dashboard &gt; Pin to dashboard &gt; Create new &gt; name it AZ900 Ops &gt; Pin.</w:t>
       </w:r>
     </w:p>
     <w:p>
@@ -13261,7 +13311,7 @@
         <w:pStyle w:val="ListNumber"/>
       </w:pPr>
       <w:r>
-        <w:t>Open **Dashboard** from the portal menu to see your pinned chart.</w:t>
+        <w:t>Open Dashboard from the portal menu to see your pinned chart.</w:t>
       </w:r>
     </w:p>
     <w:p>
@@ -13285,7 +13335,7 @@
         <w:pStyle w:val="ListNumber"/>
       </w:pPr>
       <w:r>
-        <w:t>In **Azure Monitor**, click **Activity log** (also available on every resource and resource group).</w:t>
+        <w:t>In Azure Monitor, click Activity log (also available on every resource and resource group).</w:t>
       </w:r>
     </w:p>
     <w:p>
@@ -13293,7 +13343,7 @@
         <w:pStyle w:val="ListNumber"/>
       </w:pPr>
       <w:r>
-        <w:t>Set the filters: **Timespan**: `Last 24 hours`, and add filter **Resource group**: `rg-az900-labs`.</w:t>
+        <w:t>Set the filters: Timespan: Last 24 hours, and add filter Resource group: rg-az900-labs.</w:t>
       </w:r>
     </w:p>
     <w:p>
@@ -13301,7 +13351,7 @@
         <w:pStyle w:val="ListNumber"/>
       </w:pPr>
       <w:r>
-        <w:t>Find entries from earlier labs - role assignments (Lab 12), lock create/delete (Lab 13), policy assignment (Lab 14). Click one and open the **JSON** tab to see **caller** (who), **operationName** (what) and timestamp (when).</w:t>
+        <w:t>Find entries from earlier labs - role assignments (Lab 12), lock create/delete (Lab 13), policy assignment (Lab 14). Click one and open the JSON tab to see caller (who), operationName (what) and timestamp (when).</w:t>
       </w:r>
     </w:p>
     <w:p>
@@ -13333,7 +13383,7 @@
         <w:pStyle w:val="ListBullet"/>
       </w:pPr>
       <w:r>
-        <w:t>**Log Analytics workspace**: a store into which resources, VMs and services send detailed logs.</w:t>
+        <w:t>Log Analytics workspace: a store into which resources, VMs and services send detailed logs.</w:t>
       </w:r>
     </w:p>
     <w:p>
@@ -13341,7 +13391,7 @@
         <w:pStyle w:val="ListBullet"/>
       </w:pPr>
       <w:r>
-        <w:t>**KQL (Kusto Query Language)**: the query language used across Log Analytics, e.g. `AzureActivity | where OperationNameValue contains "delete" | take 10`.</w:t>
+        <w:t>KQL (Kusto Query Language): the query language used across Log Analytics, e.g. AzureActivity | where OperationNameValue contains "delete" | take 10.</w:t>
       </w:r>
     </w:p>
     <w:p>
@@ -13373,7 +13423,7 @@
         <w:pStyle w:val="ListNumber"/>
       </w:pPr>
       <w:r>
-        <w:t>Go to **Azure Monitor** &gt; **Alerts** &gt; **Alert rules**, tick `alert-servicehealth-sea`, click **Delete**, confirm.</w:t>
+        <w:t>Go to Azure Monitor &gt; Alerts &gt; Alert rules, tick alert-servicehealth-sea, click Delete, confirm.</w:t>
       </w:r>
     </w:p>
     <w:p>
@@ -13381,7 +13431,7 @@
         <w:pStyle w:val="ListNumber"/>
       </w:pPr>
       <w:r>
-        <w:t>Go to **Azure Monitor** &gt; **Alerts** &gt; **Action groups** (or search **Action groups**), tick `ag-az900-email`, click **Delete**, confirm.</w:t>
+        <w:t>Go to Azure Monitor &gt; Alerts &gt; Action groups (or search Action groups), tick ag-az900-email, click Delete, confirm.</w:t>
       </w:r>
     </w:p>
     <w:p>
@@ -13519,7 +13569,7 @@
         <w:pStyle w:val="ListNumber"/>
       </w:pPr>
       <w:r>
-        <w:t>Search **Microsoft Entra ID** and open it.</w:t>
+        <w:t>Search Microsoft Entra ID and open it.</w:t>
       </w:r>
     </w:p>
     <w:p>
@@ -13527,7 +13577,7 @@
         <w:pStyle w:val="ListNumber"/>
       </w:pPr>
       <w:r>
-        <w:t>Click **Users**, tick `az900.learner`, click **Delete**, confirm. (The user moves to **Deleted users** for 30 days, then purges automatically.)</w:t>
+        <w:t>Click Users, tick az900.learner, click Delete, confirm. (The user moves to Deleted users for 30 days, then purges automatically.)</w:t>
       </w:r>
     </w:p>
     <w:p>
@@ -13535,7 +13585,7 @@
         <w:pStyle w:val="ListNumber"/>
       </w:pPr>
       <w:r>
-        <w:t>Click **Groups**, tick `grp-az900-learners`, click **Delete**, confirm.</w:t>
+        <w:t>Click Groups, tick grp-az900-learners, click Delete, confirm.</w:t>
       </w:r>
     </w:p>
     <w:p>
@@ -13595,7 +13645,7 @@
         <w:pStyle w:val="ListNumber"/>
       </w:pPr>
       <w:r>
-        <w:t>Open **All resources** - the list should be empty (allow a few minutes for the group deletion to finish).</w:t>
+        <w:t>Open All resources - the list should be empty (allow a few minutes for the group deletion to finish).</w:t>
       </w:r>
     </w:p>
     <w:p>
@@ -13603,7 +13653,7 @@
         <w:pStyle w:val="ListNumber"/>
       </w:pPr>
       <w:r>
-        <w:t>Open **Resource groups** - `rg-az900-labs` should be gone.</w:t>
+        <w:t>Open Resource groups - rg-az900-labs should be gone.</w:t>
       </w:r>
     </w:p>
     <w:p>
@@ -13611,7 +13661,7 @@
         <w:pStyle w:val="ListNumber"/>
       </w:pPr>
       <w:r>
-        <w:t>Optionally open **Cost Management** &gt; **Cost analysis** once more to confirm no ongoing charges.</w:t>
+        <w:t>Optionally open Cost Management &gt; Cost analysis once more to confirm no ongoing charges.</w:t>
       </w:r>
     </w:p>
     <w:p>
@@ -13643,7 +13693,7 @@
         <w:pStyle w:val="ListNumber"/>
       </w:pPr>
       <w:r>
-        <w:t>Deleted Service Health alert rule `alert-servicehealth-sea` and action group `ag-az900-email`.</w:t>
+        <w:t>Deleted Service Health alert rule alert-servicehealth-sea and action group ag-az900-email.</w:t>
       </w:r>
     </w:p>
     <w:p>
@@ -13651,7 +13701,7 @@
         <w:pStyle w:val="ListNumber"/>
       </w:pPr>
       <w:r>
-        <w:t>Removed any remaining resource lock, then deleted resource group `rg-az900-labs` (`az group delete --name rg-az900-labs --yes --no-wait`).</w:t>
+        <w:t>Removed any remaining resource lock, then deleted resource group rg-az900-labs (az group delete --name rg-az900-labs --yes --no-wait).</w:t>
       </w:r>
     </w:p>
     <w:p>
@@ -13659,7 +13709,7 @@
         <w:pStyle w:val="ListNumber"/>
       </w:pPr>
       <w:r>
-        <w:t>Deleted Entra ID user `az900.learner` and group `grp-az900-learners` (Lab 11).</w:t>
+        <w:t>Deleted Entra ID user az900.learner and group grp-az900-learners (Lab 11).</w:t>
       </w:r>
     </w:p>
     <w:p>
@@ -13667,7 +13717,7 @@
         <w:pStyle w:val="ListNumber"/>
       </w:pPr>
       <w:r>
-        <w:t>Verified **All resources** is empty. If you created the `budget-az900` budget in Lab 15 and want it gone too, delete it under **Cost Management** &gt; **Budgets**.</w:t>
+        <w:t>Verified All resources is empty. If you created the budget-az900 budget in Lab 15 and want it gone too, delete it under Cost Management &gt; Budgets.</w:t>
       </w:r>
     </w:p>
     <w:p>
@@ -13683,7 +13733,7 @@
         <w:pStyle w:val="ListBullet"/>
       </w:pPr>
       <w:r>
-        <w:t>**Azure Advisor** gives free, personalised recommendations in five categories: Cost, Security, Reliability, Operational excellence and Performance.</w:t>
+        <w:t>Azure Advisor gives free, personalised recommendations in five categories: Cost, Security, Reliability, Operational excellence and Performance.</w:t>
       </w:r>
     </w:p>
     <w:p>
@@ -13691,7 +13741,7 @@
         <w:pStyle w:val="ListBullet"/>
       </w:pPr>
       <w:r>
-        <w:t>**Service Health** reports Azure platform issues, planned maintenance and health advisories personalised to your subscriptions, and can alert you via action groups.</w:t>
+        <w:t>Service Health reports Azure platform issues, planned maintenance and health advisories personalised to your subscriptions, and can alert you via action groups.</w:t>
       </w:r>
     </w:p>
     <w:p>
@@ -13699,7 +13749,7 @@
         <w:pStyle w:val="ListBullet"/>
       </w:pPr>
       <w:r>
-        <w:t>**Azure Monitor Metrics** charts platform time-series data with no setup; the **Activity log** is the subscription audit trail of who did what.</w:t>
+        <w:t>Azure Monitor Metrics charts platform time-series data with no setup; the Activity log is the subscription audit trail of who did what.</w:t>
       </w:r>
     </w:p>
     <w:p>
@@ -13707,7 +13757,7 @@
         <w:pStyle w:val="ListBullet"/>
       </w:pPr>
       <w:r>
-        <w:t>**Log Analytics** stores detailed logs queried with **KQL**, and alert rules plus **action groups** turn signals into notifications and automation.</w:t>
+        <w:t>Log Analytics stores detailed logs queried with KQL, and alert rules plus action groups turn signals into notifications and automation.</w:t>
       </w:r>
     </w:p>
     <w:p>
@@ -13721,12 +13771,167 @@
     <w:p>
       <w:r>
         <w:br w:type="page"/>
+      </w:r>
+    </w:p>
+    <w:p>
+      <w:pPr>
+        <w:pStyle w:val="Heading1"/>
+      </w:pPr>
+      <w:r>
+        <w:t>AZ-900 Skills Reference · Effective 20 July 2026</w:t>
+      </w:r>
+    </w:p>
+    <w:p>
+      <w:r>
+        <w:t>Use this section with the mechanism-led trainer slides. Detailed click-by-click procedures remain in the sixteen lab sections. Source: Microsoft Learn AZ-900 study guide, updated 22 June 2026 for skills measured from 20 July 2026.</w:t>
+      </w:r>
+    </w:p>
+    <w:p>
+      <w:pPr/>
+      <w:r>
+        <w:t>https://learn.microsoft.com/en-us/credentials/certifications/resources/study-guides/az-900</w:t>
+      </w:r>
+    </w:p>
+    <w:p>
+      <w:pPr>
+        <w:pStyle w:val="Heading2"/>
+      </w:pPr>
+      <w:r>
+        <w:t>Describe cloud concepts (25–30%)</w:t>
+      </w:r>
+    </w:p>
+    <w:p>
+      <w:pPr>
+        <w:pStyle w:val="ListBullet"/>
+      </w:pPr>
+      <w:r>
+        <w:t>Cloud computing, shared responsibility, public/private/hybrid models, consumption pricing and serverless.</w:t>
+      </w:r>
+    </w:p>
+    <w:p>
+      <w:pPr>
+        <w:pStyle w:val="ListBullet"/>
+      </w:pPr>
+      <w:r>
+        <w:t>High availability, scalability, reliability, predictability, security, governance and manageability.</w:t>
+      </w:r>
+    </w:p>
+    <w:p>
+      <w:pPr>
+        <w:pStyle w:val="ListBullet"/>
+      </w:pPr>
+      <w:r>
+        <w:t>IaaS, PaaS and SaaS responsibilities and appropriate use cases.</w:t>
+      </w:r>
+    </w:p>
+    <w:p>
+      <w:pPr>
+        <w:pStyle w:val="Heading2"/>
+      </w:pPr>
+      <w:r>
+        <w:t>Describe Azure architecture and services (35–40%)</w:t>
+      </w:r>
+    </w:p>
+    <w:p>
+      <w:pPr>
+        <w:pStyle w:val="ListBullet"/>
+      </w:pPr>
+      <w:r>
+        <w:t>Regions, region pairs, sovereign regions, availability zones, datacenters and resource hierarchy.</w:t>
+      </w:r>
+    </w:p>
+    <w:p>
+      <w:pPr>
+        <w:pStyle w:val="ListBullet"/>
+      </w:pPr>
+      <w:r>
+        <w:t>Compute, application hosting, virtual networking, public/private endpoints, storage and migration options.</w:t>
+      </w:r>
+    </w:p>
+    <w:p>
+      <w:pPr>
+        <w:pStyle w:val="ListBullet"/>
+      </w:pPr>
+      <w:r>
+        <w:t>Microsoft Entra ID, authentication, external identities, Conditional Access, RBAC, Zero Trust and Defender for Cloud.</w:t>
+      </w:r>
+    </w:p>
+    <w:p>
+      <w:pPr>
+        <w:pStyle w:val="Heading2"/>
+      </w:pPr>
+      <w:r>
+        <w:t>Describe Azure management and governance (30–35%)</w:t>
+      </w:r>
+    </w:p>
+    <w:p>
+      <w:pPr>
+        <w:pStyle w:val="ListBullet"/>
+      </w:pPr>
+      <w:r>
+        <w:t>Cost factors, Pricing Calculator, Cost Management and tags.</w:t>
+      </w:r>
+    </w:p>
+    <w:p>
+      <w:pPr>
+        <w:pStyle w:val="ListBullet"/>
+      </w:pPr>
+      <w:r>
+        <w:t>Purview, Policy, locks, portal, Cloud Shell, CLI, PowerShell, Arc and infrastructure as code.</w:t>
+      </w:r>
+    </w:p>
+    <w:p>
+      <w:pPr>
+        <w:pStyle w:val="ListBullet"/>
+      </w:pPr>
+      <w:r>
+        <w:t>Advisor, Service Health, Azure Monitor, Log Analytics, alerts and Application Insights.</w:t>
+      </w:r>
+    </w:p>
+    <w:p>
+      <w:pPr>
+        <w:pStyle w:val="Heading2"/>
+      </w:pPr>
+      <w:r>
+        <w:t>Assessment Flow</w:t>
+      </w:r>
+    </w:p>
+    <w:p>
+      <w:pPr>
+        <w:pStyle w:val="ListNumber"/>
+      </w:pPr>
+      <w:r>
+        <w:t>Complete TRAQOM assessment digital attendance on the LMS.</w:t>
+      </w:r>
+    </w:p>
+    <w:p>
+      <w:pPr>
+        <w:pStyle w:val="ListNumber"/>
+      </w:pPr>
+      <w:r>
+        <w:t>Complete the Written Assessment, then the Practical Performance paper.</w:t>
+      </w:r>
+    </w:p>
+    <w:p>
+      <w:pPr>
+        <w:pStyle w:val="ListNumber"/>
+      </w:pPr>
+      <w:r>
+        <w:t>Upload the completed candidate papers on the LMS.</w:t>
+      </w:r>
+    </w:p>
+    <w:p>
+      <w:pPr>
+        <w:pStyle w:val="ListNumber"/>
+      </w:pPr>
+      <w:r>
+        <w:t>Sign the Assessment Summary Record with the assessor.</w:t>
       </w:r>
     </w:p>
     <w:sectPr>
       <w:footerReference w:type="default" r:id="rId31"/>
       <w:pgSz w:w="12240" w:h="15840"/>
-      <w:pgMar w:top="1152" w:right="1296" w:bottom="1152" w:left="1296" w:header="720" w:footer="720" w:gutter="0"/>
+      <w:pgMar w:top="1008" w:right="1080" w:bottom="1008" w:left="1080" w:header="720" w:footer="720" w:gutter="0"/>
       <w:cols w:space="720"/>
       <w:docGrid w:linePitch="360"/>
     </w:sectPr>
@@ -13738,56 +13943,21 @@
 <w:ftr xmlns:m="http://schemas.openxmlformats.org/officeDocument/2006/math" xmlns:mc="http://schemas.openxmlformats.org/markup-compatibility/2006" xmlns:mo="http://schemas.microsoft.com/office/mac/office/2008/main" xmlns:mv="urn:schemas-microsoft-com:mac:vml" xmlns:o="urn:schemas-microsoft-com:office:office" xmlns:r="http://schemas.openxmlformats.org/officeDocument/2006/relationships" xmlns:v="urn:schemas-microsoft-com:vml" xmlns:w10="urn:schemas-microsoft-com:office:word" xmlns:w14="http://schemas.microsoft.com/office/word/2010/wordml" xmlns:w="http://schemas.openxmlformats.org/wordprocessingml/2006/main" xmlns:wne="http://schemas.microsoft.com/office/word/2006/wordml" xmlns:wp14="http://schemas.microsoft.com/office/word/2010/wordprocessingDrawing" xmlns:wp="http://schemas.openxmlformats.org/drawingml/2006/wordprocessingDrawing" xmlns:wpc="http://schemas.microsoft.com/office/word/2010/wordprocessingCanvas" xmlns:wpg="http://schemas.microsoft.com/office/word/2010/wordprocessingGroup" xmlns:wpi="http://schemas.microsoft.com/office/word/2010/wordprocessingInk" xmlns:wps="http://schemas.microsoft.com/office/word/2010/wordprocessingShape" mc:Ignorable="w14 wp14">
   <w:p>
     <w:pPr>
-      <w:pStyle w:val="Footer"/>
       <w:jc w:val="center"/>
     </w:pPr>
     <w:r>
       <w:rPr>
-        <w:rFonts w:ascii="Arial" w:hAnsi="Arial"/>
-        <w:color w:val="5B6372"/>
-        <w:sz w:val="17"/>
+        <w:sz w:val="16"/>
+      </w:rPr>
+      <w:t xml:space="preserve">© 2026 Tertiary Infotech Academy Pte Ltd · </w:t>
+    </w:r>
+    <w:r>
+      <w:rPr>
+        <w:sz w:val="16"/>
       </w:rPr>
       <w:t xml:space="preserve">Page </w:t>
     </w:r>
-    <w:r>
-      <w:rPr>
-        <w:color w:val="5B6372"/>
-        <w:sz w:val="17"/>
-      </w:rPr>
-      <w:fldChar w:fldCharType="begin"/>
-      <w:instrText xml:space="preserve">PAGE</w:instrText>
-      <w:fldChar w:fldCharType="end"/>
-    </w:r>
-    <w:r>
-      <w:rPr>
-        <w:rFonts w:ascii="Arial" w:hAnsi="Arial"/>
-        <w:color w:val="5B6372"/>
-        <w:sz w:val="17"/>
-      </w:rPr>
-      <w:t xml:space="preserve"> of </w:t>
-    </w:r>
-    <w:r>
-      <w:rPr>
-        <w:color w:val="5B6372"/>
-        <w:sz w:val="17"/>
-      </w:rPr>
-      <w:fldChar w:fldCharType="begin"/>
-      <w:instrText xml:space="preserve">NUMPAGES</w:instrText>
-      <w:fldChar w:fldCharType="end"/>
-    </w:r>
-  </w:p>
-  <w:p>
-    <w:pPr>
-      <w:jc w:val="center"/>
-    </w:pPr>
-    <w:r>
-      <w:rPr>
-        <w:rFonts w:ascii="Arial" w:hAnsi="Arial"/>
-        <w:color w:val="5B6372"/>
-        <w:sz w:val="15"/>
-      </w:rPr>
-      <w:t>© 2026 Tertiary Infotech Academy Pte Ltd. All rights reserved.  ·  www.tertiarycourses.com.sg</w:t>
-    </w:r>
+    <w:fldSimple w:instr="PAGE"/>
   </w:p>
 </w:ftr>
 </file>
@@ -14158,7 +14328,7 @@
     <w:rPr>
       <w:rFonts w:ascii="Arial" w:hAnsi="Arial"/>
       <w:color w:val="161B26"/>
-      <w:sz w:val="21"/>
+      <w:sz w:val="22"/>
     </w:rPr>
   </w:style>
   <w:style w:type="paragraph" w:styleId="Header">
@@ -14224,7 +14394,7 @@
       <w:b/>
       <w:bCs/>
       <w:color w:val="1F6FEB"/>
-      <w:sz w:val="34"/>
+      <w:sz w:val="36"/>
       <w:szCs w:val="28"/>
     </w:rPr>
   </w:style>
@@ -14247,8 +14417,8 @@
       <w:rFonts w:asciiTheme="majorHAnsi" w:eastAsiaTheme="majorEastAsia" w:hAnsiTheme="majorHAnsi" w:cstheme="majorBidi" w:ascii="Arial" w:hAnsi="Arial"/>
       <w:b/>
       <w:bCs/>
-      <w:color w:val="111827"/>
-      <w:sz w:val="26"/>
+      <w:color w:val="108A73"/>
+      <w:sz w:val="28"/>
       <w:szCs w:val="26"/>
     </w:rPr>
   </w:style>
@@ -14271,8 +14441,8 @@
       <w:rFonts w:asciiTheme="majorHAnsi" w:eastAsiaTheme="majorEastAsia" w:hAnsiTheme="majorHAnsi" w:cstheme="majorBidi" w:ascii="Arial" w:hAnsi="Arial"/>
       <w:b/>
       <w:bCs/>
-      <w:color w:val="1F6FEB"/>
-      <w:sz w:val="21"/>
+      <w:color w:val="6D3FD2"/>
+      <w:sz w:val="24"/>
     </w:rPr>
   </w:style>
   <w:style w:type="paragraph" w:styleId="Heading4">
@@ -14512,10 +14682,10 @@
     <w:rPr>
       <w:rFonts w:asciiTheme="majorHAnsi" w:eastAsiaTheme="majorEastAsia" w:hAnsiTheme="majorHAnsi" w:cstheme="majorBidi" w:ascii="Arial" w:hAnsi="Arial"/>
       <w:b/>
-      <w:color w:val="1F6FEB"/>
+      <w:color w:val="161B26"/>
       <w:spacing w:val="5"/>
       <w:kern w:val="28"/>
-      <w:sz w:val="48"/>
+      <w:sz w:val="52"/>
       <w:szCs w:val="52"/>
     </w:rPr>
   </w:style>

</xml_diff>